<commit_message>
add fix in contract
</commit_message>
<xml_diff>
--- a/patients/templates/patients/docs/contract_revmamed_template.docx
+++ b/patients/templates/patients/docs/contract_revmamed_template.docx
@@ -114,7 +114,6 @@
         </w:rPr>
         <w:t xml:space="preserve"> </w:t>
       </w:r>
-      <w:proofErr w:type="gramStart"/>
       <w:r>
         <w:rPr>
           <w:sz w:val="14"/>
@@ -128,23 +127,7 @@
           <w:sz w:val="14"/>
           <w:szCs w:val="14"/>
         </w:rPr>
-        <w:t>patient</w:t>
-      </w:r>
-      <w:proofErr w:type="gramEnd"/>
-      <w:r>
-        <w:rPr>
-          <w:sz w:val="14"/>
-          <w:szCs w:val="14"/>
-        </w:rPr>
-        <w:t>_</w:t>
-      </w:r>
-      <w:proofErr w:type="gramStart"/>
-      <w:r>
-        <w:rPr>
-          <w:sz w:val="14"/>
-          <w:szCs w:val="14"/>
-        </w:rPr>
-        <w:t>id</w:t>
+        <w:t>patient_id</w:t>
       </w:r>
       <w:proofErr w:type="spellEnd"/>
       <w:r>
@@ -152,15 +135,7 @@
           <w:sz w:val="14"/>
           <w:szCs w:val="14"/>
         </w:rPr>
-        <w:t xml:space="preserve"> }</w:t>
-      </w:r>
-      <w:proofErr w:type="gramEnd"/>
-      <w:r>
-        <w:rPr>
-          <w:sz w:val="14"/>
-          <w:szCs w:val="14"/>
-        </w:rPr>
-        <w:t xml:space="preserve">} </w:t>
+        <w:t xml:space="preserve"> }} </w:t>
       </w:r>
       <w:r>
         <w:rPr>
@@ -217,7 +192,6 @@
                 <w:lang w:val="en-US"/>
               </w:rPr>
             </w:pPr>
-            <w:proofErr w:type="gramStart"/>
             <w:r>
               <w:rPr>
                 <w:sz w:val="14"/>
@@ -242,53 +216,25 @@
                 <w:szCs w:val="14"/>
                 <w:u w:val="single"/>
               </w:rPr>
-              <w:t>appointment</w:t>
-            </w:r>
-            <w:proofErr w:type="gramEnd"/>
+              <w:t>appointment_date</w:t>
+            </w:r>
+            <w:proofErr w:type="spellEnd"/>
             <w:r>
               <w:rPr>
                 <w:sz w:val="14"/>
                 <w:szCs w:val="14"/>
                 <w:u w:val="single"/>
               </w:rPr>
-              <w:t>_</w:t>
-            </w:r>
-            <w:proofErr w:type="gramStart"/>
+              <w:t xml:space="preserve"> </w:t>
+            </w:r>
             <w:r>
               <w:rPr>
                 <w:sz w:val="14"/>
                 <w:szCs w:val="14"/>
                 <w:u w:val="single"/>
-              </w:rPr>
-              <w:t>date</w:t>
-            </w:r>
-            <w:proofErr w:type="spellEnd"/>
-            <w:r>
-              <w:rPr>
-                <w:sz w:val="14"/>
-                <w:szCs w:val="14"/>
-                <w:u w:val="single"/>
-              </w:rPr>
-              <w:t xml:space="preserve"> </w:t>
-            </w:r>
-            <w:r>
-              <w:rPr>
-                <w:sz w:val="14"/>
-                <w:szCs w:val="14"/>
-                <w:u w:val="single"/>
-                <w:lang w:val="en-US"/>
-              </w:rPr>
-              <w:t>}</w:t>
-            </w:r>
-            <w:proofErr w:type="gramEnd"/>
-            <w:r>
-              <w:rPr>
-                <w:sz w:val="14"/>
-                <w:szCs w:val="14"/>
-                <w:u w:val="single"/>
-                <w:lang w:val="en-US"/>
-              </w:rPr>
-              <w:t>}</w:t>
+                <w:lang w:val="en-US"/>
+              </w:rPr>
+              <w:t>}}</w:t>
             </w:r>
             <w:r>
               <w:rPr>
@@ -384,7 +330,6 @@
                 <w:lang w:val="en-US"/>
               </w:rPr>
             </w:pPr>
-            <w:proofErr w:type="gramStart"/>
             <w:r>
               <w:rPr>
                 <w:sz w:val="14"/>
@@ -401,23 +346,13 @@
               </w:rPr>
               <w:t>surname</w:t>
             </w:r>
-            <w:proofErr w:type="gramEnd"/>
-            <w:r>
-              <w:rPr>
-                <w:sz w:val="14"/>
-                <w:szCs w:val="14"/>
-                <w:lang w:val="en-US"/>
-              </w:rPr>
-              <w:t xml:space="preserve"> }} </w:t>
-            </w:r>
-            <w:proofErr w:type="gramStart"/>
-            <w:r>
-              <w:rPr>
-                <w:sz w:val="14"/>
-                <w:szCs w:val="14"/>
-                <w:lang w:val="en-US"/>
-              </w:rPr>
-              <w:t xml:space="preserve">{{ </w:t>
+            <w:r>
+              <w:rPr>
+                <w:sz w:val="14"/>
+                <w:szCs w:val="14"/>
+                <w:lang w:val="en-US"/>
+              </w:rPr>
+              <w:t xml:space="preserve"> }} {{ </w:t>
             </w:r>
             <w:proofErr w:type="spellStart"/>
             <w:r>
@@ -426,25 +361,7 @@
                 <w:szCs w:val="14"/>
                 <w:lang w:val="en-US"/>
               </w:rPr>
-              <w:t>first</w:t>
-            </w:r>
-            <w:proofErr w:type="gramEnd"/>
-            <w:r>
-              <w:rPr>
-                <w:sz w:val="14"/>
-                <w:szCs w:val="14"/>
-                <w:lang w:val="en-US"/>
-              </w:rPr>
-              <w:t>_</w:t>
-            </w:r>
-            <w:proofErr w:type="gramStart"/>
-            <w:r>
-              <w:rPr>
-                <w:sz w:val="14"/>
-                <w:szCs w:val="14"/>
-                <w:lang w:val="en-US"/>
-              </w:rPr>
-              <w:t>name</w:t>
+              <w:t>first_name</w:t>
             </w:r>
             <w:proofErr w:type="spellEnd"/>
             <w:r>
@@ -453,25 +370,7 @@
                 <w:szCs w:val="14"/>
                 <w:lang w:val="en-US"/>
               </w:rPr>
-              <w:t xml:space="preserve"> }</w:t>
-            </w:r>
-            <w:proofErr w:type="gramEnd"/>
-            <w:r>
-              <w:rPr>
-                <w:sz w:val="14"/>
-                <w:szCs w:val="14"/>
-                <w:lang w:val="en-US"/>
-              </w:rPr>
-              <w:t xml:space="preserve">} </w:t>
-            </w:r>
-            <w:proofErr w:type="gramStart"/>
-            <w:r>
-              <w:rPr>
-                <w:sz w:val="14"/>
-                <w:szCs w:val="14"/>
-                <w:lang w:val="en-US"/>
-              </w:rPr>
-              <w:t xml:space="preserve">{{ </w:t>
+              <w:t xml:space="preserve"> }} {{ </w:t>
             </w:r>
             <w:proofErr w:type="spellStart"/>
             <w:r>
@@ -480,16 +379,7 @@
                 <w:szCs w:val="14"/>
                 <w:lang w:val="en-US"/>
               </w:rPr>
-              <w:t>last</w:t>
-            </w:r>
-            <w:proofErr w:type="gramEnd"/>
-            <w:r>
-              <w:rPr>
-                <w:sz w:val="14"/>
-                <w:szCs w:val="14"/>
-                <w:lang w:val="en-US"/>
-              </w:rPr>
-              <w:t>_name</w:t>
+              <w:t>last_name</w:t>
             </w:r>
             <w:proofErr w:type="spellEnd"/>
             <w:r>
@@ -611,7 +501,6 @@
                 <w:szCs w:val="14"/>
               </w:rPr>
             </w:pPr>
-            <w:proofErr w:type="gramStart"/>
             <w:r>
               <w:rPr>
                 <w:sz w:val="14"/>
@@ -627,7 +516,6 @@
               </w:rPr>
               <w:t>address</w:t>
             </w:r>
-            <w:proofErr w:type="gramEnd"/>
             <w:r>
               <w:rPr>
                 <w:sz w:val="14"/>
@@ -734,147 +622,190 @@
         <w:jc w:val="both"/>
         <w:rPr>
           <w:rFonts w:ascii="Times New Roman" w:hAnsi="Times New Roman" w:cs="Times New Roman"/>
-          <w:sz w:val="14"/>
-          <w:szCs w:val="14"/>
-        </w:rPr>
-      </w:pPr>
-      <w:r>
-        <w:rPr>
-          <w:rFonts w:ascii="Times New Roman" w:hAnsi="Times New Roman" w:cs="Times New Roman"/>
-          <w:sz w:val="14"/>
-          <w:szCs w:val="14"/>
-        </w:rPr>
-        <w:t xml:space="preserve">1.1.  </w:t>
-      </w:r>
-      <w:proofErr w:type="gramStart"/>
-      <w:r>
-        <w:rPr>
-          <w:rFonts w:ascii="Times New Roman" w:hAnsi="Times New Roman" w:cs="Times New Roman"/>
-          <w:sz w:val="14"/>
-          <w:szCs w:val="14"/>
-        </w:rPr>
-        <w:t>Исполнитель  по</w:t>
-      </w:r>
-      <w:proofErr w:type="gramEnd"/>
-      <w:r>
-        <w:rPr>
-          <w:rFonts w:ascii="Times New Roman" w:hAnsi="Times New Roman" w:cs="Times New Roman"/>
-          <w:sz w:val="14"/>
-          <w:szCs w:val="14"/>
+          <w:b/>
+          <w:bCs/>
+          <w:sz w:val="14"/>
+          <w:szCs w:val="14"/>
+          <w:u w:val="single"/>
+        </w:rPr>
+      </w:pPr>
+      <w:r>
+        <w:rPr>
+          <w:rFonts w:ascii="Times New Roman" w:hAnsi="Times New Roman" w:cs="Times New Roman"/>
+          <w:sz w:val="14"/>
+          <w:szCs w:val="14"/>
+        </w:rPr>
+        <w:t>1.1.  Исполнитель  по заданию  Заказчика  обязуется оказать следующие услуги (перечень платных мед. услуг)</w:t>
+      </w:r>
+      <w:r>
+        <w:rPr>
+          <w:rFonts w:ascii="Times New Roman" w:hAnsi="Times New Roman" w:cs="Times New Roman"/>
+          <w:sz w:val="14"/>
+          <w:szCs w:val="14"/>
+        </w:rPr>
+        <w:t xml:space="preserve">: </w:t>
+      </w:r>
+      <w:r>
+        <w:rPr>
+          <w:rFonts w:ascii="Times New Roman" w:hAnsi="Times New Roman" w:cs="Times New Roman"/>
+          <w:sz w:val="14"/>
+          <w:szCs w:val="14"/>
+          <w:u w:val="single"/>
+        </w:rPr>
+        <w:t xml:space="preserve">{{ </w:t>
+      </w:r>
+      <w:proofErr w:type="spellStart"/>
+      <w:r>
+        <w:rPr>
+          <w:rFonts w:ascii="Times New Roman" w:hAnsi="Times New Roman" w:cs="Times New Roman"/>
+          <w:sz w:val="14"/>
+          <w:szCs w:val="14"/>
+          <w:u w:val="single"/>
+        </w:rPr>
+        <w:t>services_text</w:t>
+      </w:r>
+      <w:proofErr w:type="spellEnd"/>
+      <w:r>
+        <w:rPr>
+          <w:rFonts w:ascii="Times New Roman" w:hAnsi="Times New Roman" w:cs="Times New Roman"/>
+          <w:sz w:val="14"/>
+          <w:szCs w:val="14"/>
+          <w:u w:val="single"/>
+        </w:rPr>
+        <w:t xml:space="preserve"> }}</w:t>
+      </w:r>
+      <w:r>
+        <w:rPr>
+          <w:rFonts w:ascii="Times New Roman" w:hAnsi="Times New Roman" w:cs="Times New Roman"/>
+          <w:sz w:val="14"/>
+          <w:szCs w:val="14"/>
+          <w:u w:val="single"/>
         </w:rPr>
         <w:t xml:space="preserve"> </w:t>
       </w:r>
-      <w:proofErr w:type="gramStart"/>
-      <w:r>
-        <w:rPr>
-          <w:rFonts w:ascii="Times New Roman" w:hAnsi="Times New Roman" w:cs="Times New Roman"/>
-          <w:sz w:val="14"/>
-          <w:szCs w:val="14"/>
-        </w:rPr>
-        <w:t>заданию  Заказчика</w:t>
-      </w:r>
-      <w:proofErr w:type="gramEnd"/>
-      <w:r>
-        <w:rPr>
-          <w:rFonts w:ascii="Times New Roman" w:hAnsi="Times New Roman" w:cs="Times New Roman"/>
-          <w:sz w:val="14"/>
-          <w:szCs w:val="14"/>
-        </w:rPr>
-        <w:t xml:space="preserve">  обязуется оказать следующие услуги (перечень платных мед. услуг)</w:t>
-      </w:r>
-      <w:r>
-        <w:rPr>
-          <w:rFonts w:ascii="Times New Roman" w:hAnsi="Times New Roman" w:cs="Times New Roman"/>
-          <w:sz w:val="14"/>
-          <w:szCs w:val="14"/>
-        </w:rPr>
-        <w:t xml:space="preserve">: </w:t>
-      </w:r>
-      <w:proofErr w:type="gramStart"/>
-      <w:r>
-        <w:rPr>
-          <w:rFonts w:ascii="Times New Roman" w:hAnsi="Times New Roman" w:cs="Times New Roman"/>
+      <w:r>
+        <w:rPr>
+          <w:rFonts w:ascii="Times New Roman" w:hAnsi="Times New Roman" w:cs="Times New Roman"/>
+          <w:b/>
+          <w:bCs/>
           <w:sz w:val="14"/>
           <w:szCs w:val="14"/>
           <w:u w:val="single"/>
         </w:rPr>
-        <w:t xml:space="preserve">{{ </w:t>
+        <w:t>(</w:t>
+      </w:r>
+      <w:r>
+        <w:rPr>
+          <w:rFonts w:ascii="Times New Roman" w:hAnsi="Times New Roman" w:cs="Times New Roman"/>
+          <w:b/>
+          <w:bCs/>
+          <w:sz w:val="14"/>
+          <w:szCs w:val="14"/>
+          <w:u w:val="single"/>
+        </w:rPr>
+        <w:t xml:space="preserve">ФИО врача: </w:t>
+      </w:r>
+      <w:r>
+        <w:rPr>
+          <w:rFonts w:ascii="Times New Roman" w:hAnsi="Times New Roman" w:cs="Times New Roman"/>
+          <w:b/>
+          <w:bCs/>
+          <w:sz w:val="14"/>
+          <w:szCs w:val="14"/>
+          <w:u w:val="single"/>
+        </w:rPr>
+        <w:t>{{</w:t>
       </w:r>
       <w:proofErr w:type="spellStart"/>
       <w:r>
         <w:rPr>
           <w:rFonts w:ascii="Times New Roman" w:hAnsi="Times New Roman" w:cs="Times New Roman"/>
+          <w:b/>
+          <w:bCs/>
           <w:sz w:val="14"/>
           <w:szCs w:val="14"/>
           <w:u w:val="single"/>
         </w:rPr>
-        <w:t>services</w:t>
-      </w:r>
-      <w:proofErr w:type="gramEnd"/>
-      <w:r>
-        <w:rPr>
-          <w:rFonts w:ascii="Times New Roman" w:hAnsi="Times New Roman" w:cs="Times New Roman"/>
+        <w:t>doc_surname</w:t>
+      </w:r>
+      <w:proofErr w:type="spellEnd"/>
+      <w:r>
+        <w:rPr>
+          <w:rFonts w:ascii="Times New Roman" w:hAnsi="Times New Roman" w:cs="Times New Roman"/>
+          <w:b/>
+          <w:bCs/>
           <w:sz w:val="14"/>
           <w:szCs w:val="14"/>
           <w:u w:val="single"/>
         </w:rPr>
-        <w:t>_</w:t>
-      </w:r>
-      <w:proofErr w:type="gramStart"/>
-      <w:r>
-        <w:rPr>
-          <w:rFonts w:ascii="Times New Roman" w:hAnsi="Times New Roman" w:cs="Times New Roman"/>
+        <w:t xml:space="preserve">}} {{ </w:t>
+      </w:r>
+      <w:proofErr w:type="spellStart"/>
+      <w:r>
+        <w:rPr>
+          <w:rFonts w:ascii="Times New Roman" w:hAnsi="Times New Roman" w:cs="Times New Roman"/>
+          <w:b/>
+          <w:bCs/>
           <w:sz w:val="14"/>
           <w:szCs w:val="14"/>
           <w:u w:val="single"/>
         </w:rPr>
-        <w:t>text</w:t>
+        <w:t>doc_f_name</w:t>
       </w:r>
       <w:proofErr w:type="spellEnd"/>
       <w:r>
         <w:rPr>
           <w:rFonts w:ascii="Times New Roman" w:hAnsi="Times New Roman" w:cs="Times New Roman"/>
+          <w:b/>
+          <w:bCs/>
           <w:sz w:val="14"/>
           <w:szCs w:val="14"/>
           <w:u w:val="single"/>
         </w:rPr>
-        <w:t xml:space="preserve"> }</w:t>
-      </w:r>
-      <w:proofErr w:type="gramEnd"/>
-      <w:r>
-        <w:rPr>
-          <w:rFonts w:ascii="Times New Roman" w:hAnsi="Times New Roman" w:cs="Times New Roman"/>
+        <w:t xml:space="preserve"> }} {{ </w:t>
+      </w:r>
+      <w:proofErr w:type="spellStart"/>
+      <w:r>
+        <w:rPr>
+          <w:rFonts w:ascii="Times New Roman" w:hAnsi="Times New Roman" w:cs="Times New Roman"/>
+          <w:b/>
+          <w:bCs/>
           <w:sz w:val="14"/>
           <w:szCs w:val="14"/>
           <w:u w:val="single"/>
         </w:rPr>
-        <w:t>}</w:t>
-      </w:r>
-      <w:r>
-        <w:rPr>
-          <w:rFonts w:ascii="Times New Roman" w:hAnsi="Times New Roman" w:cs="Times New Roman"/>
-          <w:sz w:val="14"/>
-          <w:szCs w:val="14"/>
-        </w:rPr>
-        <w:t xml:space="preserve">, именуемые в дальнейшем «услуги», а Заказчик обязан оплатить </w:t>
-      </w:r>
-      <w:proofErr w:type="gramStart"/>
-      <w:r>
-        <w:rPr>
-          <w:rFonts w:ascii="Times New Roman" w:hAnsi="Times New Roman" w:cs="Times New Roman"/>
-          <w:sz w:val="14"/>
-          <w:szCs w:val="14"/>
-        </w:rPr>
-        <w:t>эти  услуги</w:t>
-      </w:r>
-      <w:proofErr w:type="gramEnd"/>
-      <w:r>
-        <w:rPr>
-          <w:rFonts w:ascii="Times New Roman" w:hAnsi="Times New Roman" w:cs="Times New Roman"/>
-          <w:sz w:val="14"/>
-          <w:szCs w:val="14"/>
-        </w:rPr>
-        <w:t>.</w:t>
+        <w:t>doc_l_name</w:t>
+      </w:r>
+      <w:proofErr w:type="spellEnd"/>
+      <w:r>
+        <w:rPr>
+          <w:rFonts w:ascii="Times New Roman" w:hAnsi="Times New Roman" w:cs="Times New Roman"/>
+          <w:b/>
+          <w:bCs/>
+          <w:sz w:val="14"/>
+          <w:szCs w:val="14"/>
+          <w:u w:val="single"/>
+        </w:rPr>
+        <w:t xml:space="preserve"> }}</w:t>
+      </w:r>
+      <w:r>
+        <w:rPr>
+          <w:rFonts w:ascii="Times New Roman" w:hAnsi="Times New Roman" w:cs="Times New Roman"/>
+          <w:b/>
+          <w:bCs/>
+          <w:sz w:val="14"/>
+          <w:szCs w:val="14"/>
+          <w:u w:val="single"/>
+        </w:rPr>
+        <w:t>)</w:t>
+      </w:r>
+      <w:r>
+        <w:rPr>
+          <w:rFonts w:ascii="Times New Roman" w:hAnsi="Times New Roman" w:cs="Times New Roman"/>
+          <w:sz w:val="14"/>
+          <w:szCs w:val="14"/>
+        </w:rPr>
+        <w:t>, именуемые в дальнейшем «услуги», а Заказчик обязан оплатить эти  услуги.</w:t>
       </w:r>
     </w:p>
     <w:p>
@@ -894,79 +825,7 @@
           <w:sz w:val="14"/>
           <w:szCs w:val="14"/>
         </w:rPr>
-        <w:t xml:space="preserve">1.2. </w:t>
-      </w:r>
-      <w:proofErr w:type="gramStart"/>
-      <w:r>
-        <w:rPr>
-          <w:rFonts w:ascii="Times New Roman" w:hAnsi="Times New Roman" w:cs="Times New Roman"/>
-          <w:sz w:val="14"/>
-          <w:szCs w:val="14"/>
-        </w:rPr>
-        <w:t>Перечень  и</w:t>
-      </w:r>
-      <w:proofErr w:type="gramEnd"/>
-      <w:r>
-        <w:rPr>
-          <w:rFonts w:ascii="Times New Roman" w:hAnsi="Times New Roman" w:cs="Times New Roman"/>
-          <w:sz w:val="14"/>
-          <w:szCs w:val="14"/>
-        </w:rPr>
-        <w:t xml:space="preserve">  </w:t>
-      </w:r>
-      <w:proofErr w:type="gramStart"/>
-      <w:r>
-        <w:rPr>
-          <w:rFonts w:ascii="Times New Roman" w:hAnsi="Times New Roman" w:cs="Times New Roman"/>
-          <w:sz w:val="14"/>
-          <w:szCs w:val="14"/>
-        </w:rPr>
-        <w:t>стоимость  услуг,  предоставляемых</w:t>
-      </w:r>
-      <w:proofErr w:type="gramEnd"/>
-      <w:r>
-        <w:rPr>
-          <w:rFonts w:ascii="Times New Roman" w:hAnsi="Times New Roman" w:cs="Times New Roman"/>
-          <w:sz w:val="14"/>
-          <w:szCs w:val="14"/>
-        </w:rPr>
-        <w:t xml:space="preserve">   Заказчиком, </w:t>
-      </w:r>
-      <w:proofErr w:type="gramStart"/>
-      <w:r>
-        <w:rPr>
-          <w:rFonts w:ascii="Times New Roman" w:hAnsi="Times New Roman" w:cs="Times New Roman"/>
-          <w:sz w:val="14"/>
-          <w:szCs w:val="14"/>
-        </w:rPr>
-        <w:t>оговариваются  действующим</w:t>
-      </w:r>
-      <w:proofErr w:type="gramEnd"/>
-      <w:r>
-        <w:rPr>
-          <w:rFonts w:ascii="Times New Roman" w:hAnsi="Times New Roman" w:cs="Times New Roman"/>
-          <w:sz w:val="14"/>
-          <w:szCs w:val="14"/>
-        </w:rPr>
-        <w:t xml:space="preserve">  </w:t>
-      </w:r>
-      <w:proofErr w:type="gramStart"/>
-      <w:r>
-        <w:rPr>
-          <w:rFonts w:ascii="Times New Roman" w:hAnsi="Times New Roman" w:cs="Times New Roman"/>
-          <w:sz w:val="14"/>
-          <w:szCs w:val="14"/>
-        </w:rPr>
-        <w:t>прейскурантом  Исполнителя</w:t>
-      </w:r>
-      <w:proofErr w:type="gramEnd"/>
-      <w:r>
-        <w:rPr>
-          <w:rFonts w:ascii="Times New Roman" w:hAnsi="Times New Roman" w:cs="Times New Roman"/>
-          <w:sz w:val="14"/>
-          <w:szCs w:val="14"/>
-        </w:rPr>
-        <w:t xml:space="preserve">.  </w:t>
+        <w:t xml:space="preserve">1.2. Перечень  и  стоимость  услуг,  предоставляемых   Заказчиком, оговариваются  действующим  прейскурантом  Исполнителя.  </w:t>
       </w:r>
     </w:p>
     <w:p>
@@ -1006,79 +865,7 @@
           <w:sz w:val="14"/>
           <w:szCs w:val="14"/>
         </w:rPr>
-        <w:t xml:space="preserve">1.4. Предоставление услуг </w:t>
-      </w:r>
-      <w:proofErr w:type="gramStart"/>
-      <w:r>
-        <w:rPr>
-          <w:rFonts w:ascii="Times New Roman" w:hAnsi="Times New Roman" w:cs="Times New Roman"/>
-          <w:sz w:val="14"/>
-          <w:szCs w:val="14"/>
-        </w:rPr>
-        <w:t>по  настоящему</w:t>
-      </w:r>
-      <w:proofErr w:type="gramEnd"/>
-      <w:r>
-        <w:rPr>
-          <w:rFonts w:ascii="Times New Roman" w:hAnsi="Times New Roman" w:cs="Times New Roman"/>
-          <w:sz w:val="14"/>
-          <w:szCs w:val="14"/>
-        </w:rPr>
-        <w:t xml:space="preserve"> Договору </w:t>
-      </w:r>
-      <w:proofErr w:type="gramStart"/>
-      <w:r>
-        <w:rPr>
-          <w:rFonts w:ascii="Times New Roman" w:hAnsi="Times New Roman" w:cs="Times New Roman"/>
-          <w:sz w:val="14"/>
-          <w:szCs w:val="14"/>
-        </w:rPr>
-        <w:t>происходит  в</w:t>
-      </w:r>
-      <w:proofErr w:type="gramEnd"/>
-      <w:r>
-        <w:rPr>
-          <w:rFonts w:ascii="Times New Roman" w:hAnsi="Times New Roman" w:cs="Times New Roman"/>
-          <w:sz w:val="14"/>
-          <w:szCs w:val="14"/>
-        </w:rPr>
-        <w:t xml:space="preserve"> порядке </w:t>
-      </w:r>
-      <w:proofErr w:type="gramStart"/>
-      <w:r>
-        <w:rPr>
-          <w:rFonts w:ascii="Times New Roman" w:hAnsi="Times New Roman" w:cs="Times New Roman"/>
-          <w:sz w:val="14"/>
-          <w:szCs w:val="14"/>
-        </w:rPr>
-        <w:t>предварительной  записи</w:t>
-      </w:r>
-      <w:proofErr w:type="gramEnd"/>
-      <w:r>
-        <w:rPr>
-          <w:rFonts w:ascii="Times New Roman" w:hAnsi="Times New Roman" w:cs="Times New Roman"/>
-          <w:sz w:val="14"/>
-          <w:szCs w:val="14"/>
-        </w:rPr>
-        <w:t xml:space="preserve"> </w:t>
-      </w:r>
-      <w:proofErr w:type="gramStart"/>
-      <w:r>
-        <w:rPr>
-          <w:rFonts w:ascii="Times New Roman" w:hAnsi="Times New Roman" w:cs="Times New Roman"/>
-          <w:sz w:val="14"/>
-          <w:szCs w:val="14"/>
-        </w:rPr>
-        <w:t>Заказчика  на</w:t>
-      </w:r>
-      <w:proofErr w:type="gramEnd"/>
-      <w:r>
-        <w:rPr>
-          <w:rFonts w:ascii="Times New Roman" w:hAnsi="Times New Roman" w:cs="Times New Roman"/>
-          <w:sz w:val="14"/>
-          <w:szCs w:val="14"/>
-        </w:rPr>
-        <w:t xml:space="preserve"> прием.</w:t>
+        <w:t>1.4. Предоставление услуг по  настоящему Договору происходит  в порядке предварительной  записи Заказчика  на прием.</w:t>
       </w:r>
     </w:p>
     <w:p>
@@ -1103,38 +890,14 @@
           <w:sz w:val="14"/>
           <w:szCs w:val="14"/>
         </w:rPr>
-        <w:t>1.</w:t>
-      </w:r>
-      <w:proofErr w:type="gramStart"/>
-      <w:r>
-        <w:rPr>
-          <w:sz w:val="14"/>
-          <w:szCs w:val="14"/>
-        </w:rPr>
-        <w:t>5.Срок</w:t>
-      </w:r>
-      <w:proofErr w:type="gramEnd"/>
-      <w:r>
-        <w:rPr>
-          <w:sz w:val="14"/>
-          <w:szCs w:val="14"/>
-        </w:rPr>
-        <w:t xml:space="preserve"> предоставления услуг</w:t>
-      </w:r>
-      <w:r>
-        <w:rPr>
-          <w:sz w:val="14"/>
-          <w:szCs w:val="14"/>
-        </w:rPr>
-        <w:t xml:space="preserve"> </w:t>
-      </w:r>
-      <w:proofErr w:type="gramStart"/>
-      <w:r>
-        <w:rPr>
-          <w:sz w:val="14"/>
-          <w:szCs w:val="14"/>
-        </w:rPr>
-        <w:t xml:space="preserve">{{ </w:t>
+        <w:t>1.5.Срок предоставления услуг</w:t>
+      </w:r>
+      <w:r>
+        <w:rPr>
+          <w:sz w:val="14"/>
+          <w:szCs w:val="14"/>
+        </w:rPr>
+        <w:t xml:space="preserve"> {{ </w:t>
       </w:r>
       <w:proofErr w:type="spellStart"/>
       <w:r>
@@ -1142,23 +905,7 @@
           <w:sz w:val="14"/>
           <w:szCs w:val="14"/>
         </w:rPr>
-        <w:t>date</w:t>
-      </w:r>
-      <w:proofErr w:type="gramEnd"/>
-      <w:r>
-        <w:rPr>
-          <w:sz w:val="14"/>
-          <w:szCs w:val="14"/>
-        </w:rPr>
-        <w:t>_</w:t>
-      </w:r>
-      <w:proofErr w:type="gramStart"/>
-      <w:r>
-        <w:rPr>
-          <w:sz w:val="14"/>
-          <w:szCs w:val="14"/>
-        </w:rPr>
-        <w:t>range</w:t>
+        <w:t>date_range</w:t>
       </w:r>
       <w:proofErr w:type="spellEnd"/>
       <w:r>
@@ -1166,15 +913,7 @@
           <w:sz w:val="14"/>
           <w:szCs w:val="14"/>
         </w:rPr>
-        <w:t xml:space="preserve"> }</w:t>
-      </w:r>
-      <w:proofErr w:type="gramEnd"/>
-      <w:r>
-        <w:rPr>
-          <w:sz w:val="14"/>
-          <w:szCs w:val="14"/>
-        </w:rPr>
-        <w:t>}</w:t>
+        <w:t xml:space="preserve"> }}</w:t>
       </w:r>
     </w:p>
     <w:p>
@@ -1397,25 +1136,7 @@
           <w:sz w:val="14"/>
           <w:szCs w:val="14"/>
         </w:rPr>
-        <w:t xml:space="preserve">2.1.7. Исполнитель гарантирует право гражданина на сохранение в тайне информации о факте обращения за медицинской помощью, о состоянии здоровья, диагнозе и иных сведений, составляющих </w:t>
-      </w:r>
-      <w:proofErr w:type="gramStart"/>
-      <w:r>
-        <w:rPr>
-          <w:rFonts w:ascii="Times New Roman" w:hAnsi="Times New Roman" w:cs="Times New Roman"/>
-          <w:sz w:val="14"/>
-          <w:szCs w:val="14"/>
-        </w:rPr>
-        <w:t>врачебную тайну</w:t>
-      </w:r>
-      <w:proofErr w:type="gramEnd"/>
-      <w:r>
-        <w:rPr>
-          <w:rFonts w:ascii="Times New Roman" w:hAnsi="Times New Roman" w:cs="Times New Roman"/>
-          <w:sz w:val="14"/>
-          <w:szCs w:val="14"/>
-        </w:rPr>
-        <w:t xml:space="preserve"> и обеспечивает ее конфиденциальность.</w:t>
+        <w:t>2.1.7. Исполнитель гарантирует право гражданина на сохранение в тайне информации о факте обращения за медицинской помощью, о состоянии здоровья, диагнозе и иных сведений, составляющих врачебную тайну и обеспечивает ее конфиденциальность.</w:t>
       </w:r>
     </w:p>
     <w:p>
@@ -1517,23 +1238,7 @@
           <w:sz w:val="14"/>
           <w:szCs w:val="14"/>
         </w:rPr>
-        <w:t xml:space="preserve">2.2.1. Ознакомиться с настоящим Договором до его подписания, </w:t>
-      </w:r>
-      <w:proofErr w:type="gramStart"/>
-      <w:r>
-        <w:rPr>
-          <w:sz w:val="14"/>
-          <w:szCs w:val="14"/>
-        </w:rPr>
-        <w:t>Прейскурантом цен</w:t>
-      </w:r>
-      <w:proofErr w:type="gramEnd"/>
-      <w:r>
-        <w:rPr>
-          <w:sz w:val="14"/>
-          <w:szCs w:val="14"/>
-        </w:rPr>
-        <w:t xml:space="preserve"> и информированным добровольным Согласием, представленным Центром, Правилами оказания медицинских услуг, размещенных на информационном стенде Центра.</w:t>
+        <w:t>2.2.1. Ознакомиться с настоящим Договором до его подписания, Прейскурантом цен и информированным добровольным Согласием, представленным Центром, Правилами оказания медицинских услуг, размещенных на информационном стенде Центра.</w:t>
       </w:r>
     </w:p>
     <w:p>
@@ -1592,25 +1297,7 @@
           <w:sz w:val="14"/>
           <w:szCs w:val="14"/>
         </w:rPr>
-        <w:t xml:space="preserve">2.2.4. Предоставить при прохождении обследования и лечения полную достоверную информацию, необходимую для проведения медицинских услуг, в т.ч. о состоянии здоровья, хронических заболеваниях, а также, в случае необходимости, о могущих повлиять на ход лечения Пациента заболеваниях родственников, без указания их данных, злоупотреблении алкоголем или наркотическими препаратами, включая информацию о возможных аллергических реакциях на лекарственные препараты, пищевые или другие аллергены. </w:t>
-      </w:r>
-      <w:proofErr w:type="gramStart"/>
-      <w:r>
-        <w:rPr>
-          <w:rFonts w:ascii="Times New Roman" w:hAnsi="Times New Roman" w:cs="Times New Roman"/>
-          <w:sz w:val="14"/>
-          <w:szCs w:val="14"/>
-        </w:rPr>
-        <w:t>При наличии письменных подтверждений указанной информации,</w:t>
-      </w:r>
-      <w:proofErr w:type="gramEnd"/>
-      <w:r>
-        <w:rPr>
-          <w:rFonts w:ascii="Times New Roman" w:hAnsi="Times New Roman" w:cs="Times New Roman"/>
-          <w:sz w:val="14"/>
-          <w:szCs w:val="14"/>
-        </w:rPr>
-        <w:t xml:space="preserve"> предоставить данные подтверждения в копиях. Пациент осознает, что невыполнение предписаний Центра, несообщение необходимых сведений, нарушение предписанного режима и допущение иных нарушений могут повлечь снижение качества оказываемых услуг. Всю ответственность в данном случае несет Пациент.</w:t>
+        <w:t>2.2.4. Предоставить при прохождении обследования и лечения полную достоверную информацию, необходимую для проведения медицинских услуг, в т.ч. о состоянии здоровья, хронических заболеваниях, а также, в случае необходимости, о могущих повлиять на ход лечения Пациента заболеваниях родственников, без указания их данных, злоупотреблении алкоголем или наркотическими препаратами, включая информацию о возможных аллергических реакциях на лекарственные препараты, пищевые или другие аллергены. При наличии письменных подтверждений указанной информации, предоставить данные подтверждения в копиях. Пациент осознает, что невыполнение предписаний Центра, несообщение необходимых сведений, нарушение предписанного режима и допущение иных нарушений могут повлечь снижение качества оказываемых услуг. Всю ответственность в данном случае несет Пациент.</w:t>
       </w:r>
     </w:p>
     <w:p>
@@ -1652,61 +1339,7 @@
           <w:sz w:val="14"/>
           <w:szCs w:val="14"/>
         </w:rPr>
-        <w:t xml:space="preserve">2.2.6.  </w:t>
-      </w:r>
-      <w:proofErr w:type="gramStart"/>
-      <w:r>
-        <w:rPr>
-          <w:rFonts w:ascii="Times New Roman" w:hAnsi="Times New Roman" w:cs="Times New Roman"/>
-          <w:sz w:val="14"/>
-          <w:szCs w:val="14"/>
-        </w:rPr>
-        <w:t>Соблюдать  график</w:t>
-      </w:r>
-      <w:proofErr w:type="gramEnd"/>
-      <w:r>
-        <w:rPr>
-          <w:rFonts w:ascii="Times New Roman" w:hAnsi="Times New Roman" w:cs="Times New Roman"/>
-          <w:sz w:val="14"/>
-          <w:szCs w:val="14"/>
-        </w:rPr>
-        <w:t xml:space="preserve">  </w:t>
-      </w:r>
-      <w:proofErr w:type="gramStart"/>
-      <w:r>
-        <w:rPr>
-          <w:rFonts w:ascii="Times New Roman" w:hAnsi="Times New Roman" w:cs="Times New Roman"/>
-          <w:sz w:val="14"/>
-          <w:szCs w:val="14"/>
-        </w:rPr>
-        <w:t>приема  врачей</w:t>
-      </w:r>
-      <w:proofErr w:type="gramEnd"/>
-      <w:r>
-        <w:rPr>
-          <w:rFonts w:ascii="Times New Roman" w:hAnsi="Times New Roman" w:cs="Times New Roman"/>
-          <w:sz w:val="14"/>
-          <w:szCs w:val="14"/>
-        </w:rPr>
-        <w:t xml:space="preserve">-специалистов </w:t>
-      </w:r>
-      <w:proofErr w:type="gramStart"/>
-      <w:r>
-        <w:rPr>
-          <w:rFonts w:ascii="Times New Roman" w:hAnsi="Times New Roman" w:cs="Times New Roman"/>
-          <w:sz w:val="14"/>
-          <w:szCs w:val="14"/>
-        </w:rPr>
-        <w:t>Исполнителя,  внутренний</w:t>
-      </w:r>
-      <w:proofErr w:type="gramEnd"/>
-      <w:r>
-        <w:rPr>
-          <w:rFonts w:ascii="Times New Roman" w:hAnsi="Times New Roman" w:cs="Times New Roman"/>
-          <w:sz w:val="14"/>
-          <w:szCs w:val="14"/>
-        </w:rPr>
-        <w:t xml:space="preserve"> распорядок Исполнителя.</w:t>
+        <w:t>2.2.6.  Соблюдать  график  приема  врачей-специалистов Исполнителя,  внутренний распорядок Исполнителя.</w:t>
       </w:r>
     </w:p>
     <w:p>
@@ -1833,25 +1466,7 @@
           <w:sz w:val="14"/>
           <w:szCs w:val="14"/>
         </w:rPr>
-        <w:t xml:space="preserve">2.3.4. Требовать от Заказчика соблюдения </w:t>
-      </w:r>
-      <w:proofErr w:type="gramStart"/>
-      <w:r>
-        <w:rPr>
-          <w:rFonts w:ascii="Times New Roman" w:hAnsi="Times New Roman" w:cs="Times New Roman"/>
-          <w:sz w:val="14"/>
-          <w:szCs w:val="14"/>
-        </w:rPr>
-        <w:t>графика  прохождения</w:t>
-      </w:r>
-      <w:proofErr w:type="gramEnd"/>
-      <w:r>
-        <w:rPr>
-          <w:rFonts w:ascii="Times New Roman" w:hAnsi="Times New Roman" w:cs="Times New Roman"/>
-          <w:sz w:val="14"/>
-          <w:szCs w:val="14"/>
-        </w:rPr>
-        <w:t xml:space="preserve">  процедур, режима приема лекарственных средств, режима питания и других предписаний.</w:t>
+        <w:t>2.3.4. Требовать от Заказчика соблюдения графика  прохождения  процедур, режима приема лекарственных средств, режима питания и других предписаний.</w:t>
       </w:r>
     </w:p>
     <w:p>
@@ -1893,115 +1508,7 @@
           <w:sz w:val="14"/>
           <w:szCs w:val="14"/>
         </w:rPr>
-        <w:t xml:space="preserve">2.3.6. В случае возникновения неотложных состояний не по вине медицинских работников Исполнителя, Исполнитель имеет право самостоятельно определять объем   </w:t>
-      </w:r>
-      <w:proofErr w:type="gramStart"/>
-      <w:r>
-        <w:rPr>
-          <w:rFonts w:ascii="Times New Roman" w:hAnsi="Times New Roman" w:cs="Times New Roman"/>
-          <w:sz w:val="14"/>
-          <w:szCs w:val="14"/>
-        </w:rPr>
-        <w:t>исследований  и</w:t>
-      </w:r>
-      <w:proofErr w:type="gramEnd"/>
-      <w:r>
-        <w:rPr>
-          <w:rFonts w:ascii="Times New Roman" w:hAnsi="Times New Roman" w:cs="Times New Roman"/>
-          <w:sz w:val="14"/>
-          <w:szCs w:val="14"/>
-        </w:rPr>
-        <w:t xml:space="preserve">  </w:t>
-      </w:r>
-      <w:proofErr w:type="gramStart"/>
-      <w:r>
-        <w:rPr>
-          <w:rFonts w:ascii="Times New Roman" w:hAnsi="Times New Roman" w:cs="Times New Roman"/>
-          <w:sz w:val="14"/>
-          <w:szCs w:val="14"/>
-        </w:rPr>
-        <w:t>медицинской  помощи,  необходимых</w:t>
-      </w:r>
-      <w:proofErr w:type="gramEnd"/>
-      <w:r>
-        <w:rPr>
-          <w:rFonts w:ascii="Times New Roman" w:hAnsi="Times New Roman" w:cs="Times New Roman"/>
-          <w:sz w:val="14"/>
-          <w:szCs w:val="14"/>
-        </w:rPr>
-        <w:t xml:space="preserve">  </w:t>
-      </w:r>
-      <w:proofErr w:type="gramStart"/>
-      <w:r>
-        <w:rPr>
-          <w:rFonts w:ascii="Times New Roman" w:hAnsi="Times New Roman" w:cs="Times New Roman"/>
-          <w:sz w:val="14"/>
-          <w:szCs w:val="14"/>
-        </w:rPr>
-        <w:t>для  оказания</w:t>
-      </w:r>
-      <w:proofErr w:type="gramEnd"/>
-      <w:r>
-        <w:rPr>
-          <w:rFonts w:ascii="Times New Roman" w:hAnsi="Times New Roman" w:cs="Times New Roman"/>
-          <w:sz w:val="14"/>
-          <w:szCs w:val="14"/>
-        </w:rPr>
-        <w:t xml:space="preserve"> </w:t>
-      </w:r>
-      <w:proofErr w:type="gramStart"/>
-      <w:r>
-        <w:rPr>
-          <w:rFonts w:ascii="Times New Roman" w:hAnsi="Times New Roman" w:cs="Times New Roman"/>
-          <w:sz w:val="14"/>
-          <w:szCs w:val="14"/>
-        </w:rPr>
-        <w:t>неотложной  медицинской</w:t>
-      </w:r>
-      <w:proofErr w:type="gramEnd"/>
-      <w:r>
-        <w:rPr>
-          <w:rFonts w:ascii="Times New Roman" w:hAnsi="Times New Roman" w:cs="Times New Roman"/>
-          <w:sz w:val="14"/>
-          <w:szCs w:val="14"/>
-        </w:rPr>
-        <w:t xml:space="preserve">  </w:t>
-      </w:r>
-      <w:proofErr w:type="gramStart"/>
-      <w:r>
-        <w:rPr>
-          <w:rFonts w:ascii="Times New Roman" w:hAnsi="Times New Roman" w:cs="Times New Roman"/>
-          <w:sz w:val="14"/>
-          <w:szCs w:val="14"/>
-        </w:rPr>
-        <w:t>помощи,  в</w:t>
-      </w:r>
-      <w:proofErr w:type="gramEnd"/>
-      <w:r>
-        <w:rPr>
-          <w:rFonts w:ascii="Times New Roman" w:hAnsi="Times New Roman" w:cs="Times New Roman"/>
-          <w:sz w:val="14"/>
-          <w:szCs w:val="14"/>
-        </w:rPr>
-        <w:t xml:space="preserve">  </w:t>
-      </w:r>
-      <w:proofErr w:type="gramStart"/>
-      <w:r>
-        <w:rPr>
-          <w:rFonts w:ascii="Times New Roman" w:hAnsi="Times New Roman" w:cs="Times New Roman"/>
-          <w:sz w:val="14"/>
-          <w:szCs w:val="14"/>
-        </w:rPr>
-        <w:t>том  числе</w:t>
-      </w:r>
-      <w:proofErr w:type="gramEnd"/>
-      <w:r>
-        <w:rPr>
-          <w:rFonts w:ascii="Times New Roman" w:hAnsi="Times New Roman" w:cs="Times New Roman"/>
-          <w:sz w:val="14"/>
-          <w:szCs w:val="14"/>
-        </w:rPr>
-        <w:t xml:space="preserve"> услуг, не предусмотренных настоящим Договором.</w:t>
+        <w:t>2.3.6. В случае возникновения неотложных состояний не по вине медицинских работников Исполнителя, Исполнитель имеет право самостоятельно определять объем   исследований  и  медицинской  помощи,  необходимых  для  оказания неотложной  медицинской  помощи,  в  том  числе услуг, не предусмотренных настоящим Договором.</w:t>
       </w:r>
     </w:p>
     <w:p>
@@ -2022,43 +1529,7 @@
           <w:sz w:val="14"/>
           <w:szCs w:val="14"/>
         </w:rPr>
-        <w:t xml:space="preserve">2.3.7. Изменять </w:t>
-      </w:r>
-      <w:proofErr w:type="gramStart"/>
-      <w:r>
-        <w:rPr>
-          <w:rFonts w:ascii="Times New Roman" w:hAnsi="Times New Roman" w:cs="Times New Roman"/>
-          <w:sz w:val="14"/>
-          <w:szCs w:val="14"/>
-        </w:rPr>
-        <w:t>Прейскурант цен</w:t>
-      </w:r>
-      <w:proofErr w:type="gramEnd"/>
-      <w:r>
-        <w:rPr>
-          <w:rFonts w:ascii="Times New Roman" w:hAnsi="Times New Roman" w:cs="Times New Roman"/>
-          <w:sz w:val="14"/>
-          <w:szCs w:val="14"/>
-        </w:rPr>
-        <w:t xml:space="preserve"> в течение срока действия настоящего Договора в одностороннем порядке без согласования с Пациентом. С измененным </w:t>
-      </w:r>
-      <w:proofErr w:type="gramStart"/>
-      <w:r>
-        <w:rPr>
-          <w:rFonts w:ascii="Times New Roman" w:hAnsi="Times New Roman" w:cs="Times New Roman"/>
-          <w:sz w:val="14"/>
-          <w:szCs w:val="14"/>
-        </w:rPr>
-        <w:t>прейскурантом цен</w:t>
-      </w:r>
-      <w:proofErr w:type="gramEnd"/>
-      <w:r>
-        <w:rPr>
-          <w:rFonts w:ascii="Times New Roman" w:hAnsi="Times New Roman" w:cs="Times New Roman"/>
-          <w:sz w:val="14"/>
-          <w:szCs w:val="14"/>
-        </w:rPr>
-        <w:t xml:space="preserve"> Пациент может ознакомиться у стойки администратора при входе в Центр.</w:t>
+        <w:t>2.3.7. Изменять Прейскурант цен в течение срока действия настоящего Договора в одностороннем порядке без согласования с Пациентом. С измененным прейскурантом цен Пациент может ознакомиться у стойки администратора при входе в Центр.</w:t>
       </w:r>
     </w:p>
     <w:p>
@@ -2304,61 +1775,7 @@
           <w:sz w:val="14"/>
           <w:szCs w:val="14"/>
         </w:rPr>
-        <w:t xml:space="preserve">2.4.6. Отказаться в одностороннем порядке от получения услуги до момента </w:t>
-      </w:r>
-      <w:proofErr w:type="gramStart"/>
-      <w:r>
-        <w:rPr>
-          <w:rFonts w:ascii="Times New Roman" w:hAnsi="Times New Roman" w:cs="Times New Roman"/>
-          <w:sz w:val="14"/>
-          <w:szCs w:val="14"/>
-        </w:rPr>
-        <w:t>начала  ее</w:t>
-      </w:r>
-      <w:proofErr w:type="gramEnd"/>
-      <w:r>
-        <w:rPr>
-          <w:rFonts w:ascii="Times New Roman" w:hAnsi="Times New Roman" w:cs="Times New Roman"/>
-          <w:sz w:val="14"/>
-          <w:szCs w:val="14"/>
-        </w:rPr>
-        <w:t xml:space="preserve">  </w:t>
-      </w:r>
-      <w:proofErr w:type="gramStart"/>
-      <w:r>
-        <w:rPr>
-          <w:rFonts w:ascii="Times New Roman" w:hAnsi="Times New Roman" w:cs="Times New Roman"/>
-          <w:sz w:val="14"/>
-          <w:szCs w:val="14"/>
-        </w:rPr>
-        <w:t>оказания  и</w:t>
-      </w:r>
-      <w:proofErr w:type="gramEnd"/>
-      <w:r>
-        <w:rPr>
-          <w:rFonts w:ascii="Times New Roman" w:hAnsi="Times New Roman" w:cs="Times New Roman"/>
-          <w:sz w:val="14"/>
-          <w:szCs w:val="14"/>
-        </w:rPr>
-        <w:t xml:space="preserve">  </w:t>
-      </w:r>
-      <w:proofErr w:type="gramStart"/>
-      <w:r>
-        <w:rPr>
-          <w:rFonts w:ascii="Times New Roman" w:hAnsi="Times New Roman" w:cs="Times New Roman"/>
-          <w:sz w:val="14"/>
-          <w:szCs w:val="14"/>
-        </w:rPr>
-        <w:t>получить  обратно</w:t>
-      </w:r>
-      <w:proofErr w:type="gramEnd"/>
-      <w:r>
-        <w:rPr>
-          <w:rFonts w:ascii="Times New Roman" w:hAnsi="Times New Roman" w:cs="Times New Roman"/>
-          <w:sz w:val="14"/>
-          <w:szCs w:val="14"/>
-        </w:rPr>
-        <w:t xml:space="preserve"> уплаченную сумму.</w:t>
+        <w:t>2.4.6. Отказаться в одностороннем порядке от получения услуги до момента начала  ее  оказания  и  получить  обратно уплаченную сумму.</w:t>
       </w:r>
     </w:p>
     <w:p>
@@ -2374,25 +1791,7 @@
           <w:sz w:val="14"/>
           <w:szCs w:val="14"/>
         </w:rPr>
-        <w:t xml:space="preserve">2.4.7. </w:t>
-      </w:r>
-      <w:proofErr w:type="gramStart"/>
-      <w:r>
-        <w:rPr>
-          <w:rFonts w:ascii="Times New Roman" w:hAnsi="Times New Roman" w:cs="Times New Roman"/>
-          <w:sz w:val="14"/>
-          <w:szCs w:val="14"/>
-        </w:rPr>
-        <w:t>По  своему</w:t>
-      </w:r>
-      <w:proofErr w:type="gramEnd"/>
-      <w:r>
-        <w:rPr>
-          <w:rFonts w:ascii="Times New Roman" w:hAnsi="Times New Roman" w:cs="Times New Roman"/>
-          <w:sz w:val="14"/>
-          <w:szCs w:val="14"/>
-        </w:rPr>
-        <w:t xml:space="preserve"> выбору в случае несоблюдения Исполнителем обязательств по срокам оказания услуги:</w:t>
+        <w:t>2.4.7. По  своему выбору в случае несоблюдения Исполнителем обязательств по срокам оказания услуги:</w:t>
       </w:r>
     </w:p>
     <w:p>
@@ -2550,7 +1949,6 @@
         </w:rPr>
         <w:t xml:space="preserve">3.1. Общая стоимость медицинской услуги в соответствии с утвержденными тарифами на медицинские услуги составляет </w:t>
       </w:r>
-      <w:proofErr w:type="gramStart"/>
       <w:r>
         <w:rPr>
           <w:rFonts w:ascii="Times New Roman" w:hAnsi="Times New Roman" w:cs="Times New Roman"/>
@@ -2568,9 +1966,9 @@
           <w:szCs w:val="14"/>
           <w:u w:val="single"/>
         </w:rPr>
-        <w:t>total</w:t>
-      </w:r>
-      <w:proofErr w:type="gramEnd"/>
+        <w:t>total_price</w:t>
+      </w:r>
+      <w:proofErr w:type="spellEnd"/>
       <w:r>
         <w:rPr>
           <w:rFonts w:ascii="Times New Roman" w:hAnsi="Times New Roman" w:cs="Times New Roman"/>
@@ -2578,9 +1976,8 @@
           <w:szCs w:val="14"/>
           <w:u w:val="single"/>
         </w:rPr>
-        <w:t>_</w:t>
-      </w:r>
-      <w:proofErr w:type="gramStart"/>
+        <w:t xml:space="preserve"> }}</w:t>
+      </w:r>
       <w:r>
         <w:rPr>
           <w:rFonts w:ascii="Times New Roman" w:hAnsi="Times New Roman" w:cs="Times New Roman"/>
@@ -2588,7 +1985,35 @@
           <w:szCs w:val="14"/>
           <w:u w:val="single"/>
         </w:rPr>
-        <w:t>price</w:t>
+        <w:t xml:space="preserve"> </w:t>
+      </w:r>
+      <w:r>
+        <w:rPr>
+          <w:rFonts w:ascii="Times New Roman" w:hAnsi="Times New Roman" w:cs="Times New Roman"/>
+          <w:sz w:val="14"/>
+          <w:szCs w:val="14"/>
+          <w:u w:val="single"/>
+        </w:rPr>
+        <w:t>(</w:t>
+      </w:r>
+      <w:r>
+        <w:rPr>
+          <w:rFonts w:ascii="Times New Roman" w:hAnsi="Times New Roman" w:cs="Times New Roman"/>
+          <w:sz w:val="14"/>
+          <w:szCs w:val="14"/>
+          <w:u w:val="single"/>
+        </w:rPr>
+        <w:t xml:space="preserve">{{ </w:t>
+      </w:r>
+      <w:proofErr w:type="spellStart"/>
+      <w:r>
+        <w:rPr>
+          <w:rFonts w:ascii="Times New Roman" w:hAnsi="Times New Roman" w:cs="Times New Roman"/>
+          <w:sz w:val="14"/>
+          <w:szCs w:val="14"/>
+          <w:u w:val="single"/>
+        </w:rPr>
+        <w:t>total_price_words</w:t>
       </w:r>
       <w:proofErr w:type="spellEnd"/>
       <w:r>
@@ -2598,9 +2023,8 @@
           <w:szCs w:val="14"/>
           <w:u w:val="single"/>
         </w:rPr>
-        <w:t xml:space="preserve"> }</w:t>
-      </w:r>
-      <w:proofErr w:type="gramEnd"/>
+        <w:t xml:space="preserve"> }}</w:t>
+      </w:r>
       <w:r>
         <w:rPr>
           <w:rFonts w:ascii="Times New Roman" w:hAnsi="Times New Roman" w:cs="Times New Roman"/>
@@ -2608,93 +2032,6 @@
           <w:szCs w:val="14"/>
           <w:u w:val="single"/>
         </w:rPr>
-        <w:t>}</w:t>
-      </w:r>
-      <w:r>
-        <w:rPr>
-          <w:rFonts w:ascii="Times New Roman" w:hAnsi="Times New Roman" w:cs="Times New Roman"/>
-          <w:sz w:val="14"/>
-          <w:szCs w:val="14"/>
-          <w:u w:val="single"/>
-        </w:rPr>
-        <w:t xml:space="preserve"> </w:t>
-      </w:r>
-      <w:r>
-        <w:rPr>
-          <w:rFonts w:ascii="Times New Roman" w:hAnsi="Times New Roman" w:cs="Times New Roman"/>
-          <w:sz w:val="14"/>
-          <w:szCs w:val="14"/>
-          <w:u w:val="single"/>
-        </w:rPr>
-        <w:t>(</w:t>
-      </w:r>
-      <w:proofErr w:type="gramStart"/>
-      <w:r>
-        <w:rPr>
-          <w:rFonts w:ascii="Times New Roman" w:hAnsi="Times New Roman" w:cs="Times New Roman"/>
-          <w:sz w:val="14"/>
-          <w:szCs w:val="14"/>
-          <w:u w:val="single"/>
-        </w:rPr>
-        <w:t xml:space="preserve">{{ </w:t>
-      </w:r>
-      <w:proofErr w:type="spellStart"/>
-      <w:r>
-        <w:rPr>
-          <w:rFonts w:ascii="Times New Roman" w:hAnsi="Times New Roman" w:cs="Times New Roman"/>
-          <w:sz w:val="14"/>
-          <w:szCs w:val="14"/>
-          <w:u w:val="single"/>
-        </w:rPr>
-        <w:t>total</w:t>
-      </w:r>
-      <w:proofErr w:type="gramEnd"/>
-      <w:r>
-        <w:rPr>
-          <w:rFonts w:ascii="Times New Roman" w:hAnsi="Times New Roman" w:cs="Times New Roman"/>
-          <w:sz w:val="14"/>
-          <w:szCs w:val="14"/>
-          <w:u w:val="single"/>
-        </w:rPr>
-        <w:t>_price_</w:t>
-      </w:r>
-      <w:proofErr w:type="gramStart"/>
-      <w:r>
-        <w:rPr>
-          <w:rFonts w:ascii="Times New Roman" w:hAnsi="Times New Roman" w:cs="Times New Roman"/>
-          <w:sz w:val="14"/>
-          <w:szCs w:val="14"/>
-          <w:u w:val="single"/>
-        </w:rPr>
-        <w:t>words</w:t>
-      </w:r>
-      <w:proofErr w:type="spellEnd"/>
-      <w:r>
-        <w:rPr>
-          <w:rFonts w:ascii="Times New Roman" w:hAnsi="Times New Roman" w:cs="Times New Roman"/>
-          <w:sz w:val="14"/>
-          <w:szCs w:val="14"/>
-          <w:u w:val="single"/>
-        </w:rPr>
-        <w:t xml:space="preserve"> }</w:t>
-      </w:r>
-      <w:proofErr w:type="gramEnd"/>
-      <w:r>
-        <w:rPr>
-          <w:rFonts w:ascii="Times New Roman" w:hAnsi="Times New Roman" w:cs="Times New Roman"/>
-          <w:sz w:val="14"/>
-          <w:szCs w:val="14"/>
-          <w:u w:val="single"/>
-        </w:rPr>
-        <w:t>}</w:t>
-      </w:r>
-      <w:r>
-        <w:rPr>
-          <w:rFonts w:ascii="Times New Roman" w:hAnsi="Times New Roman" w:cs="Times New Roman"/>
-          <w:sz w:val="14"/>
-          <w:szCs w:val="14"/>
-          <w:u w:val="single"/>
-        </w:rPr>
         <w:t xml:space="preserve">) </w:t>
       </w:r>
       <w:r>
@@ -2724,25 +2061,7 @@
           <w:sz w:val="14"/>
           <w:szCs w:val="14"/>
         </w:rPr>
-        <w:t xml:space="preserve">3.2. Оплата </w:t>
-      </w:r>
-      <w:proofErr w:type="gramStart"/>
-      <w:r>
-        <w:rPr>
-          <w:rFonts w:ascii="Times New Roman" w:hAnsi="Times New Roman" w:cs="Times New Roman"/>
-          <w:sz w:val="14"/>
-          <w:szCs w:val="14"/>
-        </w:rPr>
-        <w:t>за медицинские услуги</w:t>
-      </w:r>
-      <w:proofErr w:type="gramEnd"/>
-      <w:r>
-        <w:rPr>
-          <w:rFonts w:ascii="Times New Roman" w:hAnsi="Times New Roman" w:cs="Times New Roman"/>
-          <w:sz w:val="14"/>
-          <w:szCs w:val="14"/>
-        </w:rPr>
-        <w:t xml:space="preserve"> производится путём внесения наличных денег в кассу Исполнителя. Расчеты за предоставление платных услуг осуществляются Исполнителем с применением контрольно-кассовой машины.</w:t>
+        <w:t>3.2. Оплата за медицинские услуги производится путём внесения наличных денег в кассу Исполнителя. Расчеты за предоставление платных услуг осуществляются Исполнителем с применением контрольно-кассовой машины.</w:t>
       </w:r>
     </w:p>
     <w:p>
@@ -2763,25 +2082,7 @@
           <w:sz w:val="14"/>
           <w:szCs w:val="14"/>
         </w:rPr>
-        <w:t xml:space="preserve">3.3 Оплата медицинских услуг Центра является подтверждением присоединения (акцептирования) к настоящему Договору, ознакомлением и согласием с </w:t>
-      </w:r>
-      <w:proofErr w:type="gramStart"/>
-      <w:r>
-        <w:rPr>
-          <w:rFonts w:ascii="Times New Roman" w:hAnsi="Times New Roman" w:cs="Times New Roman"/>
-          <w:sz w:val="14"/>
-          <w:szCs w:val="14"/>
-        </w:rPr>
-        <w:t>Прейскурантом цен</w:t>
-      </w:r>
-      <w:proofErr w:type="gramEnd"/>
-      <w:r>
-        <w:rPr>
-          <w:rFonts w:ascii="Times New Roman" w:hAnsi="Times New Roman" w:cs="Times New Roman"/>
-          <w:sz w:val="14"/>
-          <w:szCs w:val="14"/>
-        </w:rPr>
-        <w:t>. Оплата медицинских услуг осуществляется Пациентом в следующие сроки:</w:t>
+        <w:t>3.3 Оплата медицинских услуг Центра является подтверждением присоединения (акцептирования) к настоящему Договору, ознакомлением и согласием с Прейскурантом цен. Оплата медицинских услуг осуществляется Пациентом в следующие сроки:</w:t>
       </w:r>
     </w:p>
     <w:p>
@@ -2815,39 +2116,7 @@
           <w:sz w:val="14"/>
           <w:szCs w:val="14"/>
         </w:rPr>
-        <w:t xml:space="preserve">3.3.2. Непосредственно после оказания соответствующих медицинских услуг, </w:t>
-      </w:r>
-      <w:proofErr w:type="gramStart"/>
-      <w:r>
-        <w:rPr>
-          <w:sz w:val="14"/>
-          <w:szCs w:val="14"/>
-        </w:rPr>
-        <w:t>т.е.</w:t>
-      </w:r>
-      <w:proofErr w:type="gramEnd"/>
-      <w:r>
-        <w:rPr>
-          <w:sz w:val="14"/>
-          <w:szCs w:val="14"/>
-        </w:rPr>
-        <w:t xml:space="preserve"> в день оказания медицинских услуг, в случае если необходимость оказания медицинских услуг возникла на приеме у врача-специалиста </w:t>
-      </w:r>
-      <w:proofErr w:type="gramStart"/>
-      <w:r>
-        <w:rPr>
-          <w:sz w:val="14"/>
-          <w:szCs w:val="14"/>
-        </w:rPr>
-        <w:t>Центра</w:t>
-      </w:r>
-      <w:proofErr w:type="gramEnd"/>
-      <w:r>
-        <w:rPr>
-          <w:sz w:val="14"/>
-          <w:szCs w:val="14"/>
-        </w:rPr>
-        <w:t xml:space="preserve"> и Пациент выразил свое согласие на оказание ему дополнительных медицинских услуг. Оплата производится в кассе Центра.</w:t>
+        <w:t>3.3.2. Непосредственно после оказания соответствующих медицинских услуг, т.е. в день оказания медицинских услуг, в случае если необходимость оказания медицинских услуг возникла на приеме у врача-специалиста Центра и Пациент выразил свое согласие на оказание ему дополнительных медицинских услуг. Оплата производится в кассе Центра.</w:t>
       </w:r>
     </w:p>
     <w:p>
@@ -2945,25 +2214,7 @@
           <w:sz w:val="14"/>
           <w:szCs w:val="14"/>
         </w:rPr>
-        <w:t xml:space="preserve">4.3. При разглашении одной из сторон сведений, относящихся к категории конфиденциальной информации, виновная сторона несет ответственность и обязана возместить другой стороне понесенные </w:t>
-      </w:r>
-      <w:proofErr w:type="gramStart"/>
-      <w:r>
-        <w:rPr>
-          <w:rFonts w:ascii="Times New Roman" w:hAnsi="Times New Roman" w:cs="Times New Roman"/>
-          <w:sz w:val="14"/>
-          <w:szCs w:val="14"/>
-        </w:rPr>
-        <w:t>ей</w:t>
-      </w:r>
-      <w:proofErr w:type="gramEnd"/>
-      <w:r>
-        <w:rPr>
-          <w:rFonts w:ascii="Times New Roman" w:hAnsi="Times New Roman" w:cs="Times New Roman"/>
-          <w:sz w:val="14"/>
-          <w:szCs w:val="14"/>
-        </w:rPr>
-        <w:t xml:space="preserve"> в связи с этим убытки.</w:t>
+        <w:t>4.3. При разглашении одной из сторон сведений, относящихся к категории конфиденциальной информации, виновная сторона несет ответственность и обязана возместить другой стороне понесенные ей в связи с этим убытки.</w:t>
       </w:r>
     </w:p>
     <w:p>
@@ -3026,151 +2277,7 @@
           <w:sz w:val="14"/>
           <w:szCs w:val="14"/>
         </w:rPr>
-        <w:t xml:space="preserve">4.6. </w:t>
-      </w:r>
-      <w:proofErr w:type="gramStart"/>
-      <w:r>
-        <w:rPr>
-          <w:rFonts w:ascii="Times New Roman" w:hAnsi="Times New Roman" w:cs="Times New Roman"/>
-          <w:sz w:val="14"/>
-          <w:szCs w:val="14"/>
-        </w:rPr>
-        <w:t>За  неисполнение</w:t>
-      </w:r>
-      <w:proofErr w:type="gramEnd"/>
-      <w:r>
-        <w:rPr>
-          <w:rFonts w:ascii="Times New Roman" w:hAnsi="Times New Roman" w:cs="Times New Roman"/>
-          <w:sz w:val="14"/>
-          <w:szCs w:val="14"/>
-        </w:rPr>
-        <w:t xml:space="preserve">   либо   </w:t>
-      </w:r>
-      <w:proofErr w:type="gramStart"/>
-      <w:r>
-        <w:rPr>
-          <w:rFonts w:ascii="Times New Roman" w:hAnsi="Times New Roman" w:cs="Times New Roman"/>
-          <w:sz w:val="14"/>
-          <w:szCs w:val="14"/>
-        </w:rPr>
-        <w:t>ненадлежащее  исполнение</w:t>
-      </w:r>
-      <w:proofErr w:type="gramEnd"/>
-      <w:r>
-        <w:rPr>
-          <w:rFonts w:ascii="Times New Roman" w:hAnsi="Times New Roman" w:cs="Times New Roman"/>
-          <w:sz w:val="14"/>
-          <w:szCs w:val="14"/>
-        </w:rPr>
-        <w:t xml:space="preserve">  </w:t>
-      </w:r>
-      <w:proofErr w:type="gramStart"/>
-      <w:r>
-        <w:rPr>
-          <w:rFonts w:ascii="Times New Roman" w:hAnsi="Times New Roman" w:cs="Times New Roman"/>
-          <w:sz w:val="14"/>
-          <w:szCs w:val="14"/>
-        </w:rPr>
-        <w:t>обязательств  по</w:t>
-      </w:r>
-      <w:proofErr w:type="gramEnd"/>
-      <w:r>
-        <w:rPr>
-          <w:rFonts w:ascii="Times New Roman" w:hAnsi="Times New Roman" w:cs="Times New Roman"/>
-          <w:sz w:val="14"/>
-          <w:szCs w:val="14"/>
-        </w:rPr>
-        <w:t xml:space="preserve"> </w:t>
-      </w:r>
-      <w:proofErr w:type="gramStart"/>
-      <w:r>
-        <w:rPr>
-          <w:rFonts w:ascii="Times New Roman" w:hAnsi="Times New Roman" w:cs="Times New Roman"/>
-          <w:sz w:val="14"/>
-          <w:szCs w:val="14"/>
-        </w:rPr>
-        <w:t>договору,   в  случае</w:t>
-      </w:r>
-      <w:proofErr w:type="gramEnd"/>
-      <w:r>
-        <w:rPr>
-          <w:rFonts w:ascii="Times New Roman" w:hAnsi="Times New Roman" w:cs="Times New Roman"/>
-          <w:sz w:val="14"/>
-          <w:szCs w:val="14"/>
-        </w:rPr>
-        <w:t xml:space="preserve">  </w:t>
-      </w:r>
-      <w:proofErr w:type="gramStart"/>
-      <w:r>
-        <w:rPr>
-          <w:rFonts w:ascii="Times New Roman" w:hAnsi="Times New Roman" w:cs="Times New Roman"/>
-          <w:sz w:val="14"/>
-          <w:szCs w:val="14"/>
-        </w:rPr>
-        <w:t>причинения  вреда</w:t>
-      </w:r>
-      <w:proofErr w:type="gramEnd"/>
-      <w:r>
-        <w:rPr>
-          <w:rFonts w:ascii="Times New Roman" w:hAnsi="Times New Roman" w:cs="Times New Roman"/>
-          <w:sz w:val="14"/>
-          <w:szCs w:val="14"/>
-        </w:rPr>
-        <w:t xml:space="preserve">  </w:t>
-      </w:r>
-      <w:proofErr w:type="gramStart"/>
-      <w:r>
-        <w:rPr>
-          <w:rFonts w:ascii="Times New Roman" w:hAnsi="Times New Roman" w:cs="Times New Roman"/>
-          <w:sz w:val="14"/>
-          <w:szCs w:val="14"/>
-        </w:rPr>
-        <w:t>здоровью  или</w:t>
-      </w:r>
-      <w:proofErr w:type="gramEnd"/>
-      <w:r>
-        <w:rPr>
-          <w:rFonts w:ascii="Times New Roman" w:hAnsi="Times New Roman" w:cs="Times New Roman"/>
-          <w:sz w:val="14"/>
-          <w:szCs w:val="14"/>
-        </w:rPr>
-        <w:t xml:space="preserve">  </w:t>
-      </w:r>
-      <w:proofErr w:type="gramStart"/>
-      <w:r>
-        <w:rPr>
-          <w:rFonts w:ascii="Times New Roman" w:hAnsi="Times New Roman" w:cs="Times New Roman"/>
-          <w:sz w:val="14"/>
-          <w:szCs w:val="14"/>
-        </w:rPr>
-        <w:t>жизни  Заказчика</w:t>
-      </w:r>
-      <w:proofErr w:type="gramEnd"/>
-      <w:r>
-        <w:rPr>
-          <w:rFonts w:ascii="Times New Roman" w:hAnsi="Times New Roman" w:cs="Times New Roman"/>
-          <w:sz w:val="14"/>
-          <w:szCs w:val="14"/>
-        </w:rPr>
-        <w:t xml:space="preserve">, Исполнитель несет ответственность, предусмотренную законодательством </w:t>
-      </w:r>
-      <w:proofErr w:type="gramStart"/>
-      <w:r>
-        <w:rPr>
-          <w:rFonts w:ascii="Times New Roman" w:hAnsi="Times New Roman" w:cs="Times New Roman"/>
-          <w:sz w:val="14"/>
-          <w:szCs w:val="14"/>
-        </w:rPr>
-        <w:t>Российской  Федерации</w:t>
-      </w:r>
-      <w:proofErr w:type="gramEnd"/>
-      <w:r>
-        <w:rPr>
-          <w:rFonts w:ascii="Times New Roman" w:hAnsi="Times New Roman" w:cs="Times New Roman"/>
-          <w:sz w:val="14"/>
-          <w:szCs w:val="14"/>
-        </w:rPr>
-        <w:t>, в том числе Законом Российской Федерации «О защите прав потребителей».</w:t>
+        <w:t>4.6. За  неисполнение   либо   ненадлежащее  исполнение  обязательств  по договору,   в  случае  причинения  вреда  здоровью  или  жизни  Заказчика, Исполнитель несет ответственность, предусмотренную законодательством Российской  Федерации, в том числе Законом Российской Федерации «О защите прав потребителей».</w:t>
       </w:r>
     </w:p>
     <w:p>
@@ -3191,43 +2298,7 @@
           <w:sz w:val="14"/>
           <w:szCs w:val="14"/>
         </w:rPr>
-        <w:t xml:space="preserve">4.7. Исполнитель </w:t>
-      </w:r>
-      <w:proofErr w:type="gramStart"/>
-      <w:r>
-        <w:rPr>
-          <w:rFonts w:ascii="Times New Roman" w:hAnsi="Times New Roman" w:cs="Times New Roman"/>
-          <w:sz w:val="14"/>
-          <w:szCs w:val="14"/>
-        </w:rPr>
-        <w:t>освобождается  от</w:t>
-      </w:r>
-      <w:proofErr w:type="gramEnd"/>
-      <w:r>
-        <w:rPr>
-          <w:rFonts w:ascii="Times New Roman" w:hAnsi="Times New Roman" w:cs="Times New Roman"/>
-          <w:sz w:val="14"/>
-          <w:szCs w:val="14"/>
-        </w:rPr>
-        <w:t xml:space="preserve">  ответственности за неисполнение или </w:t>
-      </w:r>
-      <w:proofErr w:type="gramStart"/>
-      <w:r>
-        <w:rPr>
-          <w:rFonts w:ascii="Times New Roman" w:hAnsi="Times New Roman" w:cs="Times New Roman"/>
-          <w:sz w:val="14"/>
-          <w:szCs w:val="14"/>
-        </w:rPr>
-        <w:t>ненадлежащее  исполнение</w:t>
-      </w:r>
-      <w:proofErr w:type="gramEnd"/>
-      <w:r>
-        <w:rPr>
-          <w:rFonts w:ascii="Times New Roman" w:hAnsi="Times New Roman" w:cs="Times New Roman"/>
-          <w:sz w:val="14"/>
-          <w:szCs w:val="14"/>
-        </w:rPr>
-        <w:t xml:space="preserve">  настоящего Договора, если докажет, что причиной такого неисполнения (ненадлежащего исполнения) стало нарушение Заказчиком условий настоящего Договора.</w:t>
+        <w:t>4.7. Исполнитель освобождается  от  ответственности за неисполнение или ненадлежащее  исполнение  настоящего Договора, если докажет, что причиной такого неисполнения (ненадлежащего исполнения) стало нарушение Заказчиком условий настоящего Договора.</w:t>
       </w:r>
     </w:p>
     <w:p>
@@ -3512,7 +2583,6 @@
           <w:szCs w:val="14"/>
         </w:rPr>
       </w:pPr>
-      <w:proofErr w:type="gramStart"/>
       <w:r>
         <w:rPr>
           <w:rFonts w:ascii="Times New Roman" w:hAnsi="Times New Roman" w:cs="Times New Roman"/>
@@ -3527,16 +2597,7 @@
           <w:sz w:val="14"/>
           <w:szCs w:val="14"/>
         </w:rPr>
-        <w:t>По</w:t>
-      </w:r>
-      <w:proofErr w:type="gramEnd"/>
-      <w:r>
-        <w:rPr>
-          <w:rFonts w:ascii="Times New Roman" w:hAnsi="Times New Roman"/>
-          <w:sz w:val="14"/>
-          <w:szCs w:val="14"/>
-        </w:rPr>
-        <w:t xml:space="preserve"> инициативе Центра Договор может быть расторгнут в одностороннем внесудебном порядке:</w:t>
+        <w:t>По инициативе Центра Договор может быть расторгнут в одностороннем внесудебном порядке:</w:t>
       </w:r>
     </w:p>
     <w:p>
@@ -3557,25 +2618,7 @@
           <w:sz w:val="14"/>
           <w:szCs w:val="14"/>
         </w:rPr>
-        <w:t xml:space="preserve">- в случае невыполнения Пациентом рекомендаций и назначений лечащего врача (медицинского персонала Центра) (нарушение медицинских предписаний, лечебно-охранительного режима и </w:t>
-      </w:r>
-      <w:proofErr w:type="gramStart"/>
-      <w:r>
-        <w:rPr>
-          <w:rFonts w:ascii="Times New Roman" w:hAnsi="Times New Roman"/>
-          <w:sz w:val="14"/>
-          <w:szCs w:val="14"/>
-        </w:rPr>
-        <w:t>т.п.</w:t>
-      </w:r>
-      <w:proofErr w:type="gramEnd"/>
-      <w:r>
-        <w:rPr>
-          <w:rFonts w:ascii="Times New Roman" w:hAnsi="Times New Roman"/>
-          <w:sz w:val="14"/>
-          <w:szCs w:val="14"/>
-        </w:rPr>
-        <w:t>), а также нарушения Пациентом других условий настоящего Договора;</w:t>
+        <w:t>- в случае невыполнения Пациентом рекомендаций и назначений лечащего врача (медицинского персонала Центра) (нарушение медицинских предписаний, лечебно-охранительного режима и т.п.), а также нарушения Пациентом других условий настоящего Договора;</w:t>
       </w:r>
     </w:p>
     <w:p>
@@ -3671,23 +2714,7 @@
           <w:sz w:val="14"/>
           <w:szCs w:val="14"/>
         </w:rPr>
-        <w:t xml:space="preserve">. 7.3., 7.4., 7.5. Договора Сторона, являющаяся инициатором расторжения Договора, обязана уведомить вторую Сторону о расторжении Договора любым удобным способом не менее чем за 5 </w:t>
-      </w:r>
-      <w:proofErr w:type="gramStart"/>
-      <w:r>
-        <w:rPr>
-          <w:sz w:val="14"/>
-          <w:szCs w:val="14"/>
-        </w:rPr>
-        <w:t>рабочих  дней</w:t>
-      </w:r>
-      <w:proofErr w:type="gramEnd"/>
-      <w:r>
-        <w:rPr>
-          <w:sz w:val="14"/>
-          <w:szCs w:val="14"/>
-        </w:rPr>
-        <w:t xml:space="preserve"> до расторжения Договора.</w:t>
+        <w:t>. 7.3., 7.4., 7.5. Договора Сторона, являющаяся инициатором расторжения Договора, обязана уведомить вторую Сторону о расторжении Договора любым удобным способом не менее чем за 5 рабочих  дней до расторжения Договора.</w:t>
       </w:r>
     </w:p>
     <w:p>
@@ -3979,7 +3006,6 @@
               <w:t xml:space="preserve">ИНН:1101135944, КПП110101001, Свидетельство о ЕГРЮЛ серия 11 №001878557, ОГРН:1081101001860, зарегистрировано в ИФНС по </w:t>
             </w:r>
             <w:proofErr w:type="spellStart"/>
-            <w:proofErr w:type="gramStart"/>
             <w:r>
               <w:rPr>
                 <w:rFonts w:ascii="Times New Roman" w:hAnsi="Times New Roman" w:cs="Times New Roman"/>
@@ -3995,16 +3021,7 @@
                 <w:sz w:val="14"/>
                 <w:szCs w:val="14"/>
               </w:rPr>
-              <w:t xml:space="preserve">  от</w:t>
-            </w:r>
-            <w:proofErr w:type="gramEnd"/>
-            <w:r>
-              <w:rPr>
-                <w:rFonts w:ascii="Times New Roman" w:hAnsi="Times New Roman" w:cs="Times New Roman"/>
-                <w:sz w:val="14"/>
-                <w:szCs w:val="14"/>
-              </w:rPr>
-              <w:t xml:space="preserve"> 13.01.2011</w:t>
+              <w:t xml:space="preserve">  от 13.01.2011</w:t>
             </w:r>
           </w:p>
           <w:p>
@@ -4018,23 +3035,13 @@
               </w:rPr>
             </w:pPr>
             <w:proofErr w:type="spellStart"/>
-            <w:proofErr w:type="gramStart"/>
-            <w:r>
-              <w:rPr>
-                <w:rFonts w:ascii="Times New Roman" w:hAnsi="Times New Roman" w:cs="Times New Roman"/>
-                <w:sz w:val="14"/>
-                <w:szCs w:val="14"/>
-              </w:rPr>
-              <w:t>Юр.адрес</w:t>
-            </w:r>
-            <w:proofErr w:type="gramEnd"/>
-            <w:r>
-              <w:rPr>
-                <w:rFonts w:ascii="Times New Roman" w:hAnsi="Times New Roman" w:cs="Times New Roman"/>
-                <w:sz w:val="14"/>
-                <w:szCs w:val="14"/>
-              </w:rPr>
-              <w:t>:РК</w:t>
+            <w:r>
+              <w:rPr>
+                <w:rFonts w:ascii="Times New Roman" w:hAnsi="Times New Roman" w:cs="Times New Roman"/>
+                <w:sz w:val="14"/>
+                <w:szCs w:val="14"/>
+              </w:rPr>
+              <w:t>Юр.адрес:РК</w:t>
             </w:r>
             <w:proofErr w:type="spellEnd"/>
             <w:r>
@@ -4094,36 +3101,8 @@
                 <w:sz w:val="14"/>
                 <w:szCs w:val="14"/>
               </w:rPr>
-              <w:t xml:space="preserve">Л/счёт № 4070281032800009925 в Отделение №8617 Сбербанка России, БИК: </w:t>
-            </w:r>
-            <w:proofErr w:type="gramStart"/>
-            <w:r>
-              <w:rPr>
-                <w:rFonts w:ascii="Times New Roman" w:hAnsi="Times New Roman" w:cs="Times New Roman"/>
-                <w:sz w:val="14"/>
-                <w:szCs w:val="14"/>
-              </w:rPr>
-              <w:t xml:space="preserve">048702640,   </w:t>
-            </w:r>
-            <w:proofErr w:type="gramEnd"/>
-            <w:r>
-              <w:rPr>
-                <w:rFonts w:ascii="Times New Roman" w:hAnsi="Times New Roman" w:cs="Times New Roman"/>
-                <w:sz w:val="14"/>
-                <w:szCs w:val="14"/>
-              </w:rPr>
-              <w:t xml:space="preserve">                         тел(факс) (8212)30-</w:t>
-            </w:r>
-            <w:proofErr w:type="gramStart"/>
-            <w:r>
-              <w:rPr>
-                <w:rFonts w:ascii="Times New Roman" w:hAnsi="Times New Roman" w:cs="Times New Roman"/>
-                <w:sz w:val="14"/>
-                <w:szCs w:val="14"/>
-              </w:rPr>
-              <w:t>20-24</w:t>
-            </w:r>
-            <w:proofErr w:type="gramEnd"/>
+              <w:t>Л/счёт № 4070281032800009925 в Отделение №8617 Сбербанка России, БИК: 048702640,                            тел(факс) (8212)30-20-24</w:t>
+            </w:r>
           </w:p>
           <w:p>
             <w:pPr>
@@ -4152,36 +3131,8 @@
                 <w:sz w:val="14"/>
                 <w:szCs w:val="14"/>
               </w:rPr>
-              <w:t>Директор: _________________________</w:t>
-            </w:r>
-            <w:proofErr w:type="gramStart"/>
-            <w:r>
-              <w:rPr>
-                <w:rFonts w:ascii="Times New Roman" w:hAnsi="Times New Roman" w:cs="Times New Roman"/>
-                <w:sz w:val="14"/>
-                <w:szCs w:val="14"/>
-              </w:rPr>
-              <w:t>_  Епифанова</w:t>
-            </w:r>
-            <w:proofErr w:type="gramEnd"/>
-            <w:r>
-              <w:rPr>
-                <w:rFonts w:ascii="Times New Roman" w:hAnsi="Times New Roman" w:cs="Times New Roman"/>
-                <w:sz w:val="14"/>
-                <w:szCs w:val="14"/>
-              </w:rPr>
-              <w:t xml:space="preserve"> </w:t>
-            </w:r>
-            <w:proofErr w:type="gramStart"/>
-            <w:r>
-              <w:rPr>
-                <w:rFonts w:ascii="Times New Roman" w:hAnsi="Times New Roman" w:cs="Times New Roman"/>
-                <w:sz w:val="14"/>
-                <w:szCs w:val="14"/>
-              </w:rPr>
-              <w:t>О.Е.</w:t>
-            </w:r>
-            <w:proofErr w:type="gramEnd"/>
+              <w:t>Директор: __________________________  Епифанова О.Е.</w:t>
+            </w:r>
           </w:p>
         </w:tc>
         <w:tc>
@@ -4223,37 +3174,7 @@
                 <w:szCs w:val="14"/>
                 <w:lang w:val="en-US"/>
               </w:rPr>
-              <w:t xml:space="preserve"> </w:t>
-            </w:r>
-            <w:proofErr w:type="gramStart"/>
-            <w:r>
-              <w:rPr>
-                <w:rFonts w:ascii="Times New Roman" w:hAnsi="Times New Roman" w:cs="Times New Roman"/>
-                <w:sz w:val="14"/>
-                <w:szCs w:val="14"/>
-                <w:lang w:val="en-US"/>
-              </w:rPr>
-              <w:t>{{ surname</w:t>
-            </w:r>
-            <w:proofErr w:type="gramEnd"/>
-            <w:r>
-              <w:rPr>
-                <w:rFonts w:ascii="Times New Roman" w:hAnsi="Times New Roman" w:cs="Times New Roman"/>
-                <w:sz w:val="14"/>
-                <w:szCs w:val="14"/>
-                <w:lang w:val="en-US"/>
-              </w:rPr>
-              <w:t xml:space="preserve"> }} </w:t>
-            </w:r>
-            <w:proofErr w:type="gramStart"/>
-            <w:r>
-              <w:rPr>
-                <w:rFonts w:ascii="Times New Roman" w:hAnsi="Times New Roman" w:cs="Times New Roman"/>
-                <w:sz w:val="14"/>
-                <w:szCs w:val="14"/>
-                <w:lang w:val="en-US"/>
-              </w:rPr>
-              <w:t xml:space="preserve">{{ </w:t>
+              <w:t xml:space="preserve"> {{ surname }} {{ </w:t>
             </w:r>
             <w:proofErr w:type="spellStart"/>
             <w:r>
@@ -4263,27 +3184,7 @@
                 <w:szCs w:val="14"/>
                 <w:lang w:val="en-US"/>
               </w:rPr>
-              <w:t>first</w:t>
-            </w:r>
-            <w:proofErr w:type="gramEnd"/>
-            <w:r>
-              <w:rPr>
-                <w:rFonts w:ascii="Times New Roman" w:hAnsi="Times New Roman" w:cs="Times New Roman"/>
-                <w:sz w:val="14"/>
-                <w:szCs w:val="14"/>
-                <w:lang w:val="en-US"/>
-              </w:rPr>
-              <w:t>_</w:t>
-            </w:r>
-            <w:proofErr w:type="gramStart"/>
-            <w:r>
-              <w:rPr>
-                <w:rFonts w:ascii="Times New Roman" w:hAnsi="Times New Roman" w:cs="Times New Roman"/>
-                <w:sz w:val="14"/>
-                <w:szCs w:val="14"/>
-                <w:lang w:val="en-US"/>
-              </w:rPr>
-              <w:t>name</w:t>
+              <w:t>first_name</w:t>
             </w:r>
             <w:proofErr w:type="spellEnd"/>
             <w:r>
@@ -4293,27 +3194,7 @@
                 <w:szCs w:val="14"/>
                 <w:lang w:val="en-US"/>
               </w:rPr>
-              <w:t xml:space="preserve"> }</w:t>
-            </w:r>
-            <w:proofErr w:type="gramEnd"/>
-            <w:r>
-              <w:rPr>
-                <w:rFonts w:ascii="Times New Roman" w:hAnsi="Times New Roman" w:cs="Times New Roman"/>
-                <w:sz w:val="14"/>
-                <w:szCs w:val="14"/>
-                <w:lang w:val="en-US"/>
-              </w:rPr>
-              <w:t xml:space="preserve">} </w:t>
-            </w:r>
-            <w:proofErr w:type="gramStart"/>
-            <w:r>
-              <w:rPr>
-                <w:rFonts w:ascii="Times New Roman" w:hAnsi="Times New Roman" w:cs="Times New Roman"/>
-                <w:sz w:val="14"/>
-                <w:szCs w:val="14"/>
-                <w:lang w:val="en-US"/>
-              </w:rPr>
-              <w:t xml:space="preserve">{{ </w:t>
+              <w:t xml:space="preserve"> }} {{ </w:t>
             </w:r>
             <w:proofErr w:type="spellStart"/>
             <w:r>
@@ -4323,27 +3204,7 @@
                 <w:szCs w:val="14"/>
                 <w:lang w:val="en-US"/>
               </w:rPr>
-              <w:t>last</w:t>
-            </w:r>
-            <w:proofErr w:type="gramEnd"/>
-            <w:r>
-              <w:rPr>
-                <w:rFonts w:ascii="Times New Roman" w:hAnsi="Times New Roman" w:cs="Times New Roman"/>
-                <w:sz w:val="14"/>
-                <w:szCs w:val="14"/>
-                <w:lang w:val="en-US"/>
-              </w:rPr>
-              <w:t>_</w:t>
-            </w:r>
-            <w:proofErr w:type="gramStart"/>
-            <w:r>
-              <w:rPr>
-                <w:rFonts w:ascii="Times New Roman" w:hAnsi="Times New Roman" w:cs="Times New Roman"/>
-                <w:sz w:val="14"/>
-                <w:szCs w:val="14"/>
-                <w:lang w:val="en-US"/>
-              </w:rPr>
-              <w:t>name</w:t>
+              <w:t>last_name</w:t>
             </w:r>
             <w:proofErr w:type="spellEnd"/>
             <w:r>
@@ -4353,17 +3214,7 @@
                 <w:szCs w:val="14"/>
                 <w:lang w:val="en-US"/>
               </w:rPr>
-              <w:t xml:space="preserve"> }</w:t>
-            </w:r>
-            <w:proofErr w:type="gramEnd"/>
-            <w:r>
-              <w:rPr>
-                <w:rFonts w:ascii="Times New Roman" w:hAnsi="Times New Roman" w:cs="Times New Roman"/>
-                <w:sz w:val="14"/>
-                <w:szCs w:val="14"/>
-                <w:lang w:val="en-US"/>
-              </w:rPr>
-              <w:t>}</w:t>
+              <w:t xml:space="preserve"> }}</w:t>
             </w:r>
           </w:p>
           <w:p>
@@ -4448,37 +3299,7 @@
                 <w:szCs w:val="14"/>
                 <w:lang w:val="en-US"/>
               </w:rPr>
-              <w:t xml:space="preserve"> </w:t>
-            </w:r>
-            <w:proofErr w:type="gramStart"/>
-            <w:r>
-              <w:rPr>
-                <w:rFonts w:ascii="Times New Roman" w:hAnsi="Times New Roman" w:cs="Times New Roman"/>
-                <w:sz w:val="14"/>
-                <w:szCs w:val="14"/>
-                <w:lang w:val="en-US"/>
-              </w:rPr>
-              <w:t>{{ passport</w:t>
-            </w:r>
-            <w:proofErr w:type="gramEnd"/>
-            <w:r>
-              <w:rPr>
-                <w:rFonts w:ascii="Times New Roman" w:hAnsi="Times New Roman" w:cs="Times New Roman"/>
-                <w:sz w:val="14"/>
-                <w:szCs w:val="14"/>
-                <w:lang w:val="en-US"/>
-              </w:rPr>
-              <w:t xml:space="preserve"> }} </w:t>
-            </w:r>
-            <w:proofErr w:type="gramStart"/>
-            <w:r>
-              <w:rPr>
-                <w:rFonts w:ascii="Times New Roman" w:hAnsi="Times New Roman" w:cs="Times New Roman"/>
-                <w:sz w:val="14"/>
-                <w:szCs w:val="14"/>
-                <w:lang w:val="en-US"/>
-              </w:rPr>
-              <w:t xml:space="preserve">{{ </w:t>
+              <w:t xml:space="preserve"> {{ passport }} {{ </w:t>
             </w:r>
             <w:proofErr w:type="spellStart"/>
             <w:r>
@@ -4488,27 +3309,7 @@
                 <w:szCs w:val="14"/>
                 <w:lang w:val="en-US"/>
               </w:rPr>
-              <w:t>p</w:t>
-            </w:r>
-            <w:proofErr w:type="gramEnd"/>
-            <w:r>
-              <w:rPr>
-                <w:rFonts w:ascii="Times New Roman" w:hAnsi="Times New Roman" w:cs="Times New Roman"/>
-                <w:sz w:val="14"/>
-                <w:szCs w:val="14"/>
-                <w:lang w:val="en-US"/>
-              </w:rPr>
-              <w:t>_</w:t>
-            </w:r>
-            <w:proofErr w:type="gramStart"/>
-            <w:r>
-              <w:rPr>
-                <w:rFonts w:ascii="Times New Roman" w:hAnsi="Times New Roman" w:cs="Times New Roman"/>
-                <w:sz w:val="14"/>
-                <w:szCs w:val="14"/>
-                <w:lang w:val="en-US"/>
-              </w:rPr>
-              <w:t>series</w:t>
+              <w:t>p_series</w:t>
             </w:r>
             <w:proofErr w:type="spellEnd"/>
             <w:r>
@@ -4518,27 +3319,7 @@
                 <w:szCs w:val="14"/>
                 <w:lang w:val="en-US"/>
               </w:rPr>
-              <w:t xml:space="preserve"> }</w:t>
-            </w:r>
-            <w:proofErr w:type="gramEnd"/>
-            <w:r>
-              <w:rPr>
-                <w:rFonts w:ascii="Times New Roman" w:hAnsi="Times New Roman" w:cs="Times New Roman"/>
-                <w:sz w:val="14"/>
-                <w:szCs w:val="14"/>
-                <w:lang w:val="en-US"/>
-              </w:rPr>
-              <w:t xml:space="preserve">} </w:t>
-            </w:r>
-            <w:proofErr w:type="gramStart"/>
-            <w:r>
-              <w:rPr>
-                <w:rFonts w:ascii="Times New Roman" w:hAnsi="Times New Roman" w:cs="Times New Roman"/>
-                <w:sz w:val="14"/>
-                <w:szCs w:val="14"/>
-                <w:lang w:val="en-US"/>
-              </w:rPr>
-              <w:t xml:space="preserve">{{ </w:t>
+              <w:t xml:space="preserve"> }} {{ </w:t>
             </w:r>
             <w:proofErr w:type="spellStart"/>
             <w:r>
@@ -4548,27 +3329,7 @@
                 <w:szCs w:val="14"/>
                 <w:lang w:val="en-US"/>
               </w:rPr>
-              <w:t>p</w:t>
-            </w:r>
-            <w:proofErr w:type="gramEnd"/>
-            <w:r>
-              <w:rPr>
-                <w:rFonts w:ascii="Times New Roman" w:hAnsi="Times New Roman" w:cs="Times New Roman"/>
-                <w:sz w:val="14"/>
-                <w:szCs w:val="14"/>
-                <w:lang w:val="en-US"/>
-              </w:rPr>
-              <w:t>_</w:t>
-            </w:r>
-            <w:proofErr w:type="gramStart"/>
-            <w:r>
-              <w:rPr>
-                <w:rFonts w:ascii="Times New Roman" w:hAnsi="Times New Roman" w:cs="Times New Roman"/>
-                <w:sz w:val="14"/>
-                <w:szCs w:val="14"/>
-                <w:lang w:val="en-US"/>
-              </w:rPr>
-              <w:t>number</w:t>
+              <w:t>p_number</w:t>
             </w:r>
             <w:proofErr w:type="spellEnd"/>
             <w:r>
@@ -4578,17 +3339,7 @@
                 <w:szCs w:val="14"/>
                 <w:lang w:val="en-US"/>
               </w:rPr>
-              <w:t xml:space="preserve"> }</w:t>
-            </w:r>
-            <w:proofErr w:type="gramEnd"/>
-            <w:r>
-              <w:rPr>
-                <w:rFonts w:ascii="Times New Roman" w:hAnsi="Times New Roman" w:cs="Times New Roman"/>
-                <w:sz w:val="14"/>
-                <w:szCs w:val="14"/>
-                <w:lang w:val="en-US"/>
-              </w:rPr>
-              <w:t>}</w:t>
+              <w:t xml:space="preserve"> }}</w:t>
             </w:r>
           </w:p>
           <w:p>
@@ -4648,17 +3399,7 @@
                 <w:szCs w:val="14"/>
                 <w:lang w:val="en-US"/>
               </w:rPr>
-              <w:t xml:space="preserve"> </w:t>
-            </w:r>
-            <w:proofErr w:type="gramStart"/>
-            <w:r>
-              <w:rPr>
-                <w:rFonts w:ascii="Times New Roman" w:hAnsi="Times New Roman" w:cs="Times New Roman"/>
-                <w:sz w:val="14"/>
-                <w:szCs w:val="14"/>
-                <w:lang w:val="en-US"/>
-              </w:rPr>
-              <w:t xml:space="preserve">{{ </w:t>
+              <w:t xml:space="preserve"> {{ </w:t>
             </w:r>
             <w:proofErr w:type="spellStart"/>
             <w:r>
@@ -4670,7 +3411,6 @@
               </w:rPr>
               <w:t>phone</w:t>
             </w:r>
-            <w:proofErr w:type="gramEnd"/>
             <w:r>
               <w:rPr>
                 <w:rFonts w:ascii="Times New Roman" w:hAnsi="Times New Roman" w:cs="Times New Roman"/>
@@ -4680,7 +3420,6 @@
               </w:rPr>
               <w:t>_</w:t>
             </w:r>
-            <w:proofErr w:type="gramStart"/>
             <w:r>
               <w:rPr>
                 <w:rFonts w:ascii="Times New Roman" w:hAnsi="Times New Roman" w:cs="Times New Roman"/>
@@ -4698,17 +3437,7 @@
                 <w:szCs w:val="14"/>
                 <w:lang w:val="en-US"/>
               </w:rPr>
-              <w:t xml:space="preserve"> }</w:t>
-            </w:r>
-            <w:proofErr w:type="gramEnd"/>
-            <w:r>
-              <w:rPr>
-                <w:rFonts w:ascii="Times New Roman" w:hAnsi="Times New Roman" w:cs="Times New Roman"/>
-                <w:sz w:val="14"/>
-                <w:szCs w:val="14"/>
-                <w:lang w:val="en-US"/>
-              </w:rPr>
-              <w:t>}</w:t>
+              <w:t xml:space="preserve"> }}</w:t>
             </w:r>
           </w:p>
           <w:p>
@@ -4749,7 +3478,6 @@
                 <w:lang w:val="en-US"/>
               </w:rPr>
             </w:pPr>
-            <w:proofErr w:type="gramStart"/>
             <w:r>
               <w:rPr>
                 <w:rFonts w:ascii="Times New Roman" w:hAnsi="Times New Roman" w:cs="Times New Roman"/>
@@ -4758,9 +3486,9 @@
                 <w:u w:val="single"/>
                 <w:lang w:val="en-US"/>
               </w:rPr>
-              <w:t>{{ surname</w:t>
-            </w:r>
-            <w:proofErr w:type="gramEnd"/>
+              <w:t xml:space="preserve">{{ surname }} {{ </w:t>
+            </w:r>
+            <w:proofErr w:type="spellStart"/>
             <w:r>
               <w:rPr>
                 <w:rFonts w:ascii="Times New Roman" w:hAnsi="Times New Roman" w:cs="Times New Roman"/>
@@ -4769,9 +3497,9 @@
                 <w:u w:val="single"/>
                 <w:lang w:val="en-US"/>
               </w:rPr>
-              <w:t xml:space="preserve"> }} </w:t>
-            </w:r>
-            <w:proofErr w:type="gramStart"/>
+              <w:t>first_name</w:t>
+            </w:r>
+            <w:proofErr w:type="spellEnd"/>
             <w:r>
               <w:rPr>
                 <w:rFonts w:ascii="Times New Roman" w:hAnsi="Times New Roman" w:cs="Times New Roman"/>
@@ -4780,7 +3508,7 @@
                 <w:u w:val="single"/>
                 <w:lang w:val="en-US"/>
               </w:rPr>
-              <w:t xml:space="preserve">{{ </w:t>
+              <w:t xml:space="preserve"> }} {{ </w:t>
             </w:r>
             <w:proofErr w:type="spellStart"/>
             <w:r>
@@ -4791,9 +3519,9 @@
                 <w:u w:val="single"/>
                 <w:lang w:val="en-US"/>
               </w:rPr>
-              <w:t>first</w:t>
-            </w:r>
-            <w:proofErr w:type="gramEnd"/>
+              <w:t>last_name</w:t>
+            </w:r>
+            <w:proofErr w:type="spellEnd"/>
             <w:r>
               <w:rPr>
                 <w:rFonts w:ascii="Times New Roman" w:hAnsi="Times New Roman" w:cs="Times New Roman"/>
@@ -4802,106 +3530,7 @@
                 <w:u w:val="single"/>
                 <w:lang w:val="en-US"/>
               </w:rPr>
-              <w:t>_</w:t>
-            </w:r>
-            <w:proofErr w:type="gramStart"/>
-            <w:r>
-              <w:rPr>
-                <w:rFonts w:ascii="Times New Roman" w:hAnsi="Times New Roman" w:cs="Times New Roman"/>
-                <w:sz w:val="14"/>
-                <w:szCs w:val="14"/>
-                <w:u w:val="single"/>
-                <w:lang w:val="en-US"/>
-              </w:rPr>
-              <w:t>name</w:t>
-            </w:r>
-            <w:proofErr w:type="spellEnd"/>
-            <w:r>
-              <w:rPr>
-                <w:rFonts w:ascii="Times New Roman" w:hAnsi="Times New Roman" w:cs="Times New Roman"/>
-                <w:sz w:val="14"/>
-                <w:szCs w:val="14"/>
-                <w:u w:val="single"/>
-                <w:lang w:val="en-US"/>
-              </w:rPr>
-              <w:t xml:space="preserve"> }</w:t>
-            </w:r>
-            <w:proofErr w:type="gramEnd"/>
-            <w:r>
-              <w:rPr>
-                <w:rFonts w:ascii="Times New Roman" w:hAnsi="Times New Roman" w:cs="Times New Roman"/>
-                <w:sz w:val="14"/>
-                <w:szCs w:val="14"/>
-                <w:u w:val="single"/>
-                <w:lang w:val="en-US"/>
-              </w:rPr>
-              <w:t xml:space="preserve">} </w:t>
-            </w:r>
-            <w:proofErr w:type="gramStart"/>
-            <w:r>
-              <w:rPr>
-                <w:rFonts w:ascii="Times New Roman" w:hAnsi="Times New Roman" w:cs="Times New Roman"/>
-                <w:sz w:val="14"/>
-                <w:szCs w:val="14"/>
-                <w:u w:val="single"/>
-                <w:lang w:val="en-US"/>
-              </w:rPr>
-              <w:t xml:space="preserve">{{ </w:t>
-            </w:r>
-            <w:proofErr w:type="spellStart"/>
-            <w:r>
-              <w:rPr>
-                <w:rFonts w:ascii="Times New Roman" w:hAnsi="Times New Roman" w:cs="Times New Roman"/>
-                <w:sz w:val="14"/>
-                <w:szCs w:val="14"/>
-                <w:u w:val="single"/>
-                <w:lang w:val="en-US"/>
-              </w:rPr>
-              <w:t>last</w:t>
-            </w:r>
-            <w:proofErr w:type="gramEnd"/>
-            <w:r>
-              <w:rPr>
-                <w:rFonts w:ascii="Times New Roman" w:hAnsi="Times New Roman" w:cs="Times New Roman"/>
-                <w:sz w:val="14"/>
-                <w:szCs w:val="14"/>
-                <w:u w:val="single"/>
-                <w:lang w:val="en-US"/>
-              </w:rPr>
-              <w:t>_</w:t>
-            </w:r>
-            <w:proofErr w:type="gramStart"/>
-            <w:r>
-              <w:rPr>
-                <w:rFonts w:ascii="Times New Roman" w:hAnsi="Times New Roman" w:cs="Times New Roman"/>
-                <w:sz w:val="14"/>
-                <w:szCs w:val="14"/>
-                <w:u w:val="single"/>
-                <w:lang w:val="en-US"/>
-              </w:rPr>
-              <w:t>name</w:t>
-            </w:r>
-            <w:proofErr w:type="spellEnd"/>
-            <w:r>
-              <w:rPr>
-                <w:rFonts w:ascii="Times New Roman" w:hAnsi="Times New Roman" w:cs="Times New Roman"/>
-                <w:sz w:val="14"/>
-                <w:szCs w:val="14"/>
-                <w:u w:val="single"/>
-                <w:lang w:val="en-US"/>
-              </w:rPr>
-              <w:t xml:space="preserve"> }</w:t>
-            </w:r>
-            <w:proofErr w:type="gramEnd"/>
-            <w:r>
-              <w:rPr>
-                <w:rFonts w:ascii="Times New Roman" w:hAnsi="Times New Roman" w:cs="Times New Roman"/>
-                <w:sz w:val="14"/>
-                <w:szCs w:val="14"/>
-                <w:u w:val="single"/>
-                <w:lang w:val="en-US"/>
-              </w:rPr>
-              <w:t>}</w:t>
+              <w:t xml:space="preserve"> }}</w:t>
             </w:r>
             <w:r>
               <w:rPr>
@@ -5599,7 +4228,6 @@
   <w:style w:type="character" w:default="1" w:styleId="a0">
     <w:name w:val="Default Paragraph Font"/>
     <w:uiPriority w:val="1"/>
-    <w:semiHidden/>
     <w:unhideWhenUsed/>
   </w:style>
   <w:style w:type="table" w:default="1" w:styleId="a1">

</xml_diff>